<commit_message>
agent collecteur et agents complet, manque TLS
</commit_message>
<xml_diff>
--- a/Agents/guide config.docx
+++ b/Agents/guide config.docx
@@ -773,33 +773,2323 @@
           <w:szCs w:val="24"/>
         </w:rPr>
       </w:pPr>
-    </w:p>
-    <w:p>
-      <w:pPr>
-        <w:rPr>
-          <w:rFonts w:ascii="Cambria" w:hAnsi="Cambria"/>
-          <w:sz w:val="24"/>
-          <w:szCs w:val="24"/>
-        </w:rPr>
-      </w:pPr>
-    </w:p>
-    <w:p>
-      <w:pPr>
-        <w:rPr>
-          <w:rFonts w:ascii="Cambria" w:hAnsi="Cambria"/>
-          <w:sz w:val="24"/>
-          <w:szCs w:val="24"/>
-        </w:rPr>
-      </w:pPr>
-    </w:p>
-    <w:p>
-      <w:pPr>
-        <w:rPr>
-          <w:rFonts w:ascii="Cambria" w:hAnsi="Cambria"/>
-          <w:sz w:val="24"/>
-          <w:szCs w:val="24"/>
-        </w:rPr>
-      </w:pPr>
+      <w:r>
+        <w:rPr>
+          <w:rFonts w:ascii="Cambria" w:hAnsi="Cambria"/>
+          <w:sz w:val="24"/>
+          <w:szCs w:val="24"/>
+        </w:rPr>
+        <w:t>Format JSON :</w:t>
+      </w:r>
+    </w:p>
+    <w:p>
+      <w:pPr>
+        <w:pStyle w:val="Paragraphedeliste"/>
+        <w:numPr>
+          <w:ilvl w:val="0"/>
+          <w:numId w:val="2"/>
+        </w:numPr>
+        <w:rPr>
+          <w:rFonts w:ascii="Cambria" w:hAnsi="Cambria"/>
+          <w:b/>
+          <w:bCs/>
+          <w:sz w:val="24"/>
+          <w:szCs w:val="24"/>
+        </w:rPr>
+      </w:pPr>
+      <w:r>
+        <w:rPr>
+          <w:rFonts w:ascii="Cambria" w:hAnsi="Cambria"/>
+          <w:b/>
+          <w:bCs/>
+        </w:rPr>
+        <w:t>GET /action/block-</w:t>
+      </w:r>
+      <w:proofErr w:type="spellStart"/>
+      <w:r>
+        <w:rPr>
+          <w:rFonts w:ascii="Cambria" w:hAnsi="Cambria"/>
+          <w:b/>
+          <w:bCs/>
+        </w:rPr>
+        <w:t>ip</w:t>
+      </w:r>
+      <w:proofErr w:type="spellEnd"/>
+    </w:p>
+    <w:p>
+      <w:pPr>
+        <w:rPr>
+          <w:rFonts w:ascii="Cambria" w:hAnsi="Cambria"/>
+          <w:sz w:val="24"/>
+          <w:szCs w:val="24"/>
+        </w:rPr>
+      </w:pPr>
+      <w:r>
+        <w:rPr>
+          <w:rFonts w:ascii="Cambria" w:hAnsi="Cambria"/>
+          <w:sz w:val="24"/>
+          <w:szCs w:val="24"/>
+        </w:rPr>
+        <w:t>[</w:t>
+      </w:r>
+    </w:p>
+    <w:p>
+      <w:pPr>
+        <w:rPr>
+          <w:rFonts w:ascii="Cambria" w:hAnsi="Cambria"/>
+          <w:sz w:val="24"/>
+          <w:szCs w:val="24"/>
+        </w:rPr>
+      </w:pPr>
+      <w:r>
+        <w:rPr>
+          <w:rFonts w:ascii="Cambria" w:hAnsi="Cambria"/>
+          <w:sz w:val="24"/>
+          <w:szCs w:val="24"/>
+        </w:rPr>
+        <w:t xml:space="preserve">  {</w:t>
+      </w:r>
+    </w:p>
+    <w:p>
+      <w:pPr>
+        <w:rPr>
+          <w:rFonts w:ascii="Cambria" w:hAnsi="Cambria"/>
+          <w:sz w:val="24"/>
+          <w:szCs w:val="24"/>
+        </w:rPr>
+      </w:pPr>
+      <w:r>
+        <w:rPr>
+          <w:rFonts w:ascii="Cambria" w:hAnsi="Cambria"/>
+          <w:sz w:val="24"/>
+          <w:szCs w:val="24"/>
+        </w:rPr>
+        <w:t xml:space="preserve">    "</w:t>
+      </w:r>
+      <w:proofErr w:type="spellStart"/>
+      <w:r>
+        <w:rPr>
+          <w:rFonts w:ascii="Cambria" w:hAnsi="Cambria"/>
+          <w:sz w:val="24"/>
+          <w:szCs w:val="24"/>
+        </w:rPr>
+        <w:t>command_id</w:t>
+      </w:r>
+      <w:proofErr w:type="spellEnd"/>
+      <w:proofErr w:type="gramStart"/>
+      <w:r>
+        <w:rPr>
+          <w:rFonts w:ascii="Cambria" w:hAnsi="Cambria"/>
+          <w:sz w:val="24"/>
+          <w:szCs w:val="24"/>
+        </w:rPr>
+        <w:t>":</w:t>
+      </w:r>
+      <w:proofErr w:type="gramEnd"/>
+      <w:r>
+        <w:rPr>
+          <w:rFonts w:ascii="Cambria" w:hAnsi="Cambria"/>
+          <w:sz w:val="24"/>
+          <w:szCs w:val="24"/>
+        </w:rPr>
+        <w:t xml:space="preserve"> "CMD-0001",</w:t>
+      </w:r>
+    </w:p>
+    <w:p>
+      <w:pPr>
+        <w:rPr>
+          <w:rFonts w:ascii="Cambria" w:hAnsi="Cambria"/>
+          <w:sz w:val="24"/>
+          <w:szCs w:val="24"/>
+        </w:rPr>
+      </w:pPr>
+      <w:r>
+        <w:rPr>
+          <w:rFonts w:ascii="Cambria" w:hAnsi="Cambria"/>
+          <w:sz w:val="24"/>
+          <w:szCs w:val="24"/>
+        </w:rPr>
+        <w:t xml:space="preserve">    "</w:t>
+      </w:r>
+      <w:proofErr w:type="spellStart"/>
+      <w:r>
+        <w:rPr>
+          <w:rFonts w:ascii="Cambria" w:hAnsi="Cambria"/>
+          <w:sz w:val="24"/>
+          <w:szCs w:val="24"/>
+        </w:rPr>
+        <w:t>agent_id</w:t>
+      </w:r>
+      <w:proofErr w:type="spellEnd"/>
+      <w:proofErr w:type="gramStart"/>
+      <w:r>
+        <w:rPr>
+          <w:rFonts w:ascii="Cambria" w:hAnsi="Cambria"/>
+          <w:sz w:val="24"/>
+          <w:szCs w:val="24"/>
+        </w:rPr>
+        <w:t>":</w:t>
+      </w:r>
+      <w:proofErr w:type="gramEnd"/>
+      <w:r>
+        <w:rPr>
+          <w:rFonts w:ascii="Cambria" w:hAnsi="Cambria"/>
+          <w:sz w:val="24"/>
+          <w:szCs w:val="24"/>
+        </w:rPr>
+        <w:t xml:space="preserve"> "AGENT-001",</w:t>
+      </w:r>
+    </w:p>
+    <w:p>
+      <w:pPr>
+        <w:rPr>
+          <w:rFonts w:ascii="Cambria" w:hAnsi="Cambria"/>
+          <w:sz w:val="24"/>
+          <w:szCs w:val="24"/>
+        </w:rPr>
+      </w:pPr>
+      <w:r>
+        <w:rPr>
+          <w:rFonts w:ascii="Cambria" w:hAnsi="Cambria"/>
+          <w:sz w:val="24"/>
+          <w:szCs w:val="24"/>
+        </w:rPr>
+        <w:t xml:space="preserve">    "</w:t>
+      </w:r>
+      <w:proofErr w:type="spellStart"/>
+      <w:r>
+        <w:rPr>
+          <w:rFonts w:ascii="Cambria" w:hAnsi="Cambria"/>
+          <w:sz w:val="24"/>
+          <w:szCs w:val="24"/>
+        </w:rPr>
+        <w:t>created_at</w:t>
+      </w:r>
+      <w:proofErr w:type="spellEnd"/>
+      <w:proofErr w:type="gramStart"/>
+      <w:r>
+        <w:rPr>
+          <w:rFonts w:ascii="Cambria" w:hAnsi="Cambria"/>
+          <w:sz w:val="24"/>
+          <w:szCs w:val="24"/>
+        </w:rPr>
+        <w:t>":</w:t>
+      </w:r>
+      <w:proofErr w:type="gramEnd"/>
+      <w:r>
+        <w:rPr>
+          <w:rFonts w:ascii="Cambria" w:hAnsi="Cambria"/>
+          <w:sz w:val="24"/>
+          <w:szCs w:val="24"/>
+        </w:rPr>
+        <w:t xml:space="preserve"> "2026-06-28T11:10:00Z",</w:t>
+      </w:r>
+    </w:p>
+    <w:p>
+      <w:pPr>
+        <w:rPr>
+          <w:rFonts w:ascii="Cambria" w:hAnsi="Cambria"/>
+          <w:sz w:val="24"/>
+          <w:szCs w:val="24"/>
+        </w:rPr>
+      </w:pPr>
+      <w:r>
+        <w:rPr>
+          <w:rFonts w:ascii="Cambria" w:hAnsi="Cambria"/>
+          <w:sz w:val="24"/>
+          <w:szCs w:val="24"/>
+        </w:rPr>
+        <w:t xml:space="preserve">    "</w:t>
+      </w:r>
+      <w:proofErr w:type="spellStart"/>
+      <w:r>
+        <w:rPr>
+          <w:rFonts w:ascii="Cambria" w:hAnsi="Cambria"/>
+          <w:sz w:val="24"/>
+          <w:szCs w:val="24"/>
+        </w:rPr>
+        <w:t>name</w:t>
+      </w:r>
+      <w:proofErr w:type="spellEnd"/>
+      <w:proofErr w:type="gramStart"/>
+      <w:r>
+        <w:rPr>
+          <w:rFonts w:ascii="Cambria" w:hAnsi="Cambria"/>
+          <w:sz w:val="24"/>
+          <w:szCs w:val="24"/>
+        </w:rPr>
+        <w:t>":</w:t>
+      </w:r>
+      <w:proofErr w:type="gramEnd"/>
+      <w:r>
+        <w:rPr>
+          <w:rFonts w:ascii="Cambria" w:hAnsi="Cambria"/>
+          <w:sz w:val="24"/>
+          <w:szCs w:val="24"/>
+        </w:rPr>
+        <w:t xml:space="preserve"> "Bloquer IP malveillante",</w:t>
+      </w:r>
+    </w:p>
+    <w:p>
+      <w:pPr>
+        <w:rPr>
+          <w:rFonts w:ascii="Cambria" w:hAnsi="Cambria"/>
+          <w:sz w:val="24"/>
+          <w:szCs w:val="24"/>
+        </w:rPr>
+      </w:pPr>
+      <w:r>
+        <w:rPr>
+          <w:rFonts w:ascii="Cambria" w:hAnsi="Cambria"/>
+          <w:sz w:val="24"/>
+          <w:szCs w:val="24"/>
+        </w:rPr>
+        <w:t xml:space="preserve">    "description</w:t>
+      </w:r>
+      <w:proofErr w:type="gramStart"/>
+      <w:r>
+        <w:rPr>
+          <w:rFonts w:ascii="Cambria" w:hAnsi="Cambria"/>
+          <w:sz w:val="24"/>
+          <w:szCs w:val="24"/>
+        </w:rPr>
+        <w:t>":</w:t>
+      </w:r>
+      <w:proofErr w:type="gramEnd"/>
+      <w:r>
+        <w:rPr>
+          <w:rFonts w:ascii="Cambria" w:hAnsi="Cambria"/>
+          <w:sz w:val="24"/>
+          <w:szCs w:val="24"/>
+        </w:rPr>
+        <w:t xml:space="preserve"> "Blocage automatique suite à une détection SIEM",</w:t>
+      </w:r>
+    </w:p>
+    <w:p>
+      <w:pPr>
+        <w:rPr>
+          <w:rFonts w:ascii="Cambria" w:hAnsi="Cambria"/>
+          <w:sz w:val="24"/>
+          <w:szCs w:val="24"/>
+        </w:rPr>
+      </w:pPr>
+      <w:r>
+        <w:rPr>
+          <w:rFonts w:ascii="Cambria" w:hAnsi="Cambria"/>
+          <w:sz w:val="24"/>
+          <w:szCs w:val="24"/>
+        </w:rPr>
+        <w:t xml:space="preserve">    "</w:t>
+      </w:r>
+      <w:proofErr w:type="spellStart"/>
+      <w:r>
+        <w:rPr>
+          <w:rFonts w:ascii="Cambria" w:hAnsi="Cambria"/>
+          <w:sz w:val="24"/>
+          <w:szCs w:val="24"/>
+        </w:rPr>
+        <w:t>enabled</w:t>
+      </w:r>
+      <w:proofErr w:type="spellEnd"/>
+      <w:proofErr w:type="gramStart"/>
+      <w:r>
+        <w:rPr>
+          <w:rFonts w:ascii="Cambria" w:hAnsi="Cambria"/>
+          <w:sz w:val="24"/>
+          <w:szCs w:val="24"/>
+        </w:rPr>
+        <w:t>":</w:t>
+      </w:r>
+      <w:proofErr w:type="gramEnd"/>
+      <w:r>
+        <w:rPr>
+          <w:rFonts w:ascii="Cambria" w:hAnsi="Cambria"/>
+          <w:sz w:val="24"/>
+          <w:szCs w:val="24"/>
+        </w:rPr>
+        <w:t xml:space="preserve"> </w:t>
+      </w:r>
+      <w:proofErr w:type="spellStart"/>
+      <w:r>
+        <w:rPr>
+          <w:rFonts w:ascii="Cambria" w:hAnsi="Cambria"/>
+          <w:sz w:val="24"/>
+          <w:szCs w:val="24"/>
+        </w:rPr>
+        <w:t>true</w:t>
+      </w:r>
+      <w:proofErr w:type="spellEnd"/>
+      <w:r>
+        <w:rPr>
+          <w:rFonts w:ascii="Cambria" w:hAnsi="Cambria"/>
+          <w:sz w:val="24"/>
+          <w:szCs w:val="24"/>
+        </w:rPr>
+        <w:t>,</w:t>
+      </w:r>
+    </w:p>
+    <w:p>
+      <w:pPr>
+        <w:rPr>
+          <w:rFonts w:ascii="Cambria" w:hAnsi="Cambria"/>
+          <w:sz w:val="24"/>
+          <w:szCs w:val="24"/>
+        </w:rPr>
+      </w:pPr>
+      <w:r>
+        <w:rPr>
+          <w:rFonts w:ascii="Cambria" w:hAnsi="Cambria"/>
+          <w:sz w:val="24"/>
+          <w:szCs w:val="24"/>
+        </w:rPr>
+        <w:t xml:space="preserve">    "</w:t>
+      </w:r>
+      <w:proofErr w:type="spellStart"/>
+      <w:r>
+        <w:rPr>
+          <w:rFonts w:ascii="Cambria" w:hAnsi="Cambria"/>
+          <w:sz w:val="24"/>
+          <w:szCs w:val="24"/>
+        </w:rPr>
+        <w:t>steps</w:t>
+      </w:r>
+      <w:proofErr w:type="spellEnd"/>
+      <w:proofErr w:type="gramStart"/>
+      <w:r>
+        <w:rPr>
+          <w:rFonts w:ascii="Cambria" w:hAnsi="Cambria"/>
+          <w:sz w:val="24"/>
+          <w:szCs w:val="24"/>
+        </w:rPr>
+        <w:t>":</w:t>
+      </w:r>
+      <w:proofErr w:type="gramEnd"/>
+      <w:r>
+        <w:rPr>
+          <w:rFonts w:ascii="Cambria" w:hAnsi="Cambria"/>
+          <w:sz w:val="24"/>
+          <w:szCs w:val="24"/>
+        </w:rPr>
+        <w:t xml:space="preserve"> [</w:t>
+      </w:r>
+    </w:p>
+    <w:p>
+      <w:pPr>
+        <w:rPr>
+          <w:rFonts w:ascii="Cambria" w:hAnsi="Cambria"/>
+          <w:sz w:val="24"/>
+          <w:szCs w:val="24"/>
+        </w:rPr>
+      </w:pPr>
+      <w:r>
+        <w:rPr>
+          <w:rFonts w:ascii="Cambria" w:hAnsi="Cambria"/>
+          <w:sz w:val="24"/>
+          <w:szCs w:val="24"/>
+        </w:rPr>
+        <w:t xml:space="preserve">      {</w:t>
+      </w:r>
+    </w:p>
+    <w:p>
+      <w:pPr>
+        <w:rPr>
+          <w:rFonts w:ascii="Cambria" w:hAnsi="Cambria"/>
+          <w:sz w:val="24"/>
+          <w:szCs w:val="24"/>
+        </w:rPr>
+      </w:pPr>
+      <w:r>
+        <w:rPr>
+          <w:rFonts w:ascii="Cambria" w:hAnsi="Cambria"/>
+          <w:sz w:val="24"/>
+          <w:szCs w:val="24"/>
+        </w:rPr>
+        <w:t xml:space="preserve">        "action</w:t>
+      </w:r>
+      <w:proofErr w:type="gramStart"/>
+      <w:r>
+        <w:rPr>
+          <w:rFonts w:ascii="Cambria" w:hAnsi="Cambria"/>
+          <w:sz w:val="24"/>
+          <w:szCs w:val="24"/>
+        </w:rPr>
+        <w:t>":</w:t>
+      </w:r>
+      <w:proofErr w:type="gramEnd"/>
+      <w:r>
+        <w:rPr>
+          <w:rFonts w:ascii="Cambria" w:hAnsi="Cambria"/>
+          <w:sz w:val="24"/>
+          <w:szCs w:val="24"/>
+        </w:rPr>
+        <w:t xml:space="preserve"> "</w:t>
+      </w:r>
+      <w:proofErr w:type="spellStart"/>
+      <w:r>
+        <w:rPr>
+          <w:rFonts w:ascii="Cambria" w:hAnsi="Cambria"/>
+          <w:sz w:val="24"/>
+          <w:szCs w:val="24"/>
+        </w:rPr>
+        <w:t>block_ip</w:t>
+      </w:r>
+      <w:proofErr w:type="spellEnd"/>
+      <w:r>
+        <w:rPr>
+          <w:rFonts w:ascii="Cambria" w:hAnsi="Cambria"/>
+          <w:sz w:val="24"/>
+          <w:szCs w:val="24"/>
+        </w:rPr>
+        <w:t>",</w:t>
+      </w:r>
+    </w:p>
+    <w:p>
+      <w:pPr>
+        <w:rPr>
+          <w:rFonts w:ascii="Cambria" w:hAnsi="Cambria"/>
+          <w:sz w:val="24"/>
+          <w:szCs w:val="24"/>
+        </w:rPr>
+      </w:pPr>
+      <w:r>
+        <w:rPr>
+          <w:rFonts w:ascii="Cambria" w:hAnsi="Cambria"/>
+          <w:sz w:val="24"/>
+          <w:szCs w:val="24"/>
+        </w:rPr>
+        <w:t xml:space="preserve">        "params</w:t>
+      </w:r>
+      <w:proofErr w:type="gramStart"/>
+      <w:r>
+        <w:rPr>
+          <w:rFonts w:ascii="Cambria" w:hAnsi="Cambria"/>
+          <w:sz w:val="24"/>
+          <w:szCs w:val="24"/>
+        </w:rPr>
+        <w:t>":</w:t>
+      </w:r>
+      <w:proofErr w:type="gramEnd"/>
+      <w:r>
+        <w:rPr>
+          <w:rFonts w:ascii="Cambria" w:hAnsi="Cambria"/>
+          <w:sz w:val="24"/>
+          <w:szCs w:val="24"/>
+        </w:rPr>
+        <w:t xml:space="preserve"> {</w:t>
+      </w:r>
+    </w:p>
+    <w:p>
+      <w:pPr>
+        <w:rPr>
+          <w:rFonts w:ascii="Cambria" w:hAnsi="Cambria"/>
+          <w:sz w:val="24"/>
+          <w:szCs w:val="24"/>
+        </w:rPr>
+      </w:pPr>
+      <w:r>
+        <w:rPr>
+          <w:rFonts w:ascii="Cambria" w:hAnsi="Cambria"/>
+          <w:sz w:val="24"/>
+          <w:szCs w:val="24"/>
+        </w:rPr>
+        <w:t xml:space="preserve">          "</w:t>
+      </w:r>
+      <w:proofErr w:type="spellStart"/>
+      <w:r>
+        <w:rPr>
+          <w:rFonts w:ascii="Cambria" w:hAnsi="Cambria"/>
+          <w:sz w:val="24"/>
+          <w:szCs w:val="24"/>
+        </w:rPr>
+        <w:t>ip</w:t>
+      </w:r>
+      <w:proofErr w:type="spellEnd"/>
+      <w:proofErr w:type="gramStart"/>
+      <w:r>
+        <w:rPr>
+          <w:rFonts w:ascii="Cambria" w:hAnsi="Cambria"/>
+          <w:sz w:val="24"/>
+          <w:szCs w:val="24"/>
+        </w:rPr>
+        <w:t>":</w:t>
+      </w:r>
+      <w:proofErr w:type="gramEnd"/>
+      <w:r>
+        <w:rPr>
+          <w:rFonts w:ascii="Cambria" w:hAnsi="Cambria"/>
+          <w:sz w:val="24"/>
+          <w:szCs w:val="24"/>
+        </w:rPr>
+        <w:t xml:space="preserve"> "192.168.10.55",</w:t>
+      </w:r>
+    </w:p>
+    <w:p>
+      <w:pPr>
+        <w:rPr>
+          <w:rFonts w:ascii="Cambria" w:hAnsi="Cambria"/>
+          <w:sz w:val="24"/>
+          <w:szCs w:val="24"/>
+        </w:rPr>
+      </w:pPr>
+      <w:r>
+        <w:rPr>
+          <w:rFonts w:ascii="Cambria" w:hAnsi="Cambria"/>
+          <w:sz w:val="24"/>
+          <w:szCs w:val="24"/>
+        </w:rPr>
+        <w:t xml:space="preserve">          "comment</w:t>
+      </w:r>
+      <w:proofErr w:type="gramStart"/>
+      <w:r>
+        <w:rPr>
+          <w:rFonts w:ascii="Cambria" w:hAnsi="Cambria"/>
+          <w:sz w:val="24"/>
+          <w:szCs w:val="24"/>
+        </w:rPr>
+        <w:t>":</w:t>
+      </w:r>
+      <w:proofErr w:type="gramEnd"/>
+      <w:r>
+        <w:rPr>
+          <w:rFonts w:ascii="Cambria" w:hAnsi="Cambria"/>
+          <w:sz w:val="24"/>
+          <w:szCs w:val="24"/>
+        </w:rPr>
+        <w:t xml:space="preserve"> "Tentatives de brute force SSH"</w:t>
+      </w:r>
+    </w:p>
+    <w:p>
+      <w:pPr>
+        <w:rPr>
+          <w:rFonts w:ascii="Cambria" w:hAnsi="Cambria"/>
+          <w:sz w:val="24"/>
+          <w:szCs w:val="24"/>
+        </w:rPr>
+      </w:pPr>
+      <w:r>
+        <w:rPr>
+          <w:rFonts w:ascii="Cambria" w:hAnsi="Cambria"/>
+          <w:sz w:val="24"/>
+          <w:szCs w:val="24"/>
+        </w:rPr>
+        <w:t xml:space="preserve">        }</w:t>
+      </w:r>
+    </w:p>
+    <w:p>
+      <w:pPr>
+        <w:rPr>
+          <w:rFonts w:ascii="Cambria" w:hAnsi="Cambria"/>
+          <w:sz w:val="24"/>
+          <w:szCs w:val="24"/>
+        </w:rPr>
+      </w:pPr>
+      <w:r>
+        <w:rPr>
+          <w:rFonts w:ascii="Cambria" w:hAnsi="Cambria"/>
+          <w:sz w:val="24"/>
+          <w:szCs w:val="24"/>
+        </w:rPr>
+        <w:t xml:space="preserve">      }</w:t>
+      </w:r>
+    </w:p>
+    <w:p>
+      <w:pPr>
+        <w:rPr>
+          <w:rFonts w:ascii="Cambria" w:hAnsi="Cambria"/>
+          <w:sz w:val="24"/>
+          <w:szCs w:val="24"/>
+        </w:rPr>
+      </w:pPr>
+      <w:r>
+        <w:rPr>
+          <w:rFonts w:ascii="Cambria" w:hAnsi="Cambria"/>
+          <w:sz w:val="24"/>
+          <w:szCs w:val="24"/>
+        </w:rPr>
+        <w:lastRenderedPageBreak/>
+        <w:t xml:space="preserve">    ],</w:t>
+      </w:r>
+    </w:p>
+    <w:p>
+      <w:pPr>
+        <w:rPr>
+          <w:rFonts w:ascii="Cambria" w:hAnsi="Cambria"/>
+          <w:sz w:val="24"/>
+          <w:szCs w:val="24"/>
+        </w:rPr>
+      </w:pPr>
+      <w:r>
+        <w:rPr>
+          <w:rFonts w:ascii="Cambria" w:hAnsi="Cambria"/>
+          <w:sz w:val="24"/>
+          <w:szCs w:val="24"/>
+        </w:rPr>
+        <w:t xml:space="preserve">    "</w:t>
+      </w:r>
+      <w:proofErr w:type="spellStart"/>
+      <w:r>
+        <w:rPr>
+          <w:rFonts w:ascii="Cambria" w:hAnsi="Cambria"/>
+          <w:sz w:val="24"/>
+          <w:szCs w:val="24"/>
+        </w:rPr>
+        <w:t>timeout_seconds</w:t>
+      </w:r>
+      <w:proofErr w:type="spellEnd"/>
+      <w:proofErr w:type="gramStart"/>
+      <w:r>
+        <w:rPr>
+          <w:rFonts w:ascii="Cambria" w:hAnsi="Cambria"/>
+          <w:sz w:val="24"/>
+          <w:szCs w:val="24"/>
+        </w:rPr>
+        <w:t>":</w:t>
+      </w:r>
+      <w:proofErr w:type="gramEnd"/>
+      <w:r>
+        <w:rPr>
+          <w:rFonts w:ascii="Cambria" w:hAnsi="Cambria"/>
+          <w:sz w:val="24"/>
+          <w:szCs w:val="24"/>
+        </w:rPr>
+        <w:t xml:space="preserve"> 60,</w:t>
+      </w:r>
+    </w:p>
+    <w:p>
+      <w:pPr>
+        <w:rPr>
+          <w:rFonts w:ascii="Cambria" w:hAnsi="Cambria"/>
+          <w:sz w:val="24"/>
+          <w:szCs w:val="24"/>
+        </w:rPr>
+      </w:pPr>
+      <w:r>
+        <w:rPr>
+          <w:rFonts w:ascii="Cambria" w:hAnsi="Cambria"/>
+          <w:sz w:val="24"/>
+          <w:szCs w:val="24"/>
+        </w:rPr>
+        <w:t xml:space="preserve">    "</w:t>
+      </w:r>
+      <w:proofErr w:type="spellStart"/>
+      <w:r>
+        <w:rPr>
+          <w:rFonts w:ascii="Cambria" w:hAnsi="Cambria"/>
+          <w:sz w:val="24"/>
+          <w:szCs w:val="24"/>
+        </w:rPr>
+        <w:t>max_retries</w:t>
+      </w:r>
+      <w:proofErr w:type="spellEnd"/>
+      <w:proofErr w:type="gramStart"/>
+      <w:r>
+        <w:rPr>
+          <w:rFonts w:ascii="Cambria" w:hAnsi="Cambria"/>
+          <w:sz w:val="24"/>
+          <w:szCs w:val="24"/>
+        </w:rPr>
+        <w:t>":</w:t>
+      </w:r>
+      <w:proofErr w:type="gramEnd"/>
+      <w:r>
+        <w:rPr>
+          <w:rFonts w:ascii="Cambria" w:hAnsi="Cambria"/>
+          <w:sz w:val="24"/>
+          <w:szCs w:val="24"/>
+        </w:rPr>
+        <w:t xml:space="preserve"> 3</w:t>
+      </w:r>
+    </w:p>
+    <w:p>
+      <w:pPr>
+        <w:rPr>
+          <w:rFonts w:ascii="Cambria" w:hAnsi="Cambria"/>
+          <w:sz w:val="24"/>
+          <w:szCs w:val="24"/>
+        </w:rPr>
+      </w:pPr>
+      <w:r>
+        <w:rPr>
+          <w:rFonts w:ascii="Cambria" w:hAnsi="Cambria"/>
+          <w:sz w:val="24"/>
+          <w:szCs w:val="24"/>
+        </w:rPr>
+        <w:t xml:space="preserve">  }</w:t>
+      </w:r>
+    </w:p>
+    <w:p>
+      <w:pPr>
+        <w:rPr>
+          <w:rFonts w:ascii="Cambria" w:hAnsi="Cambria"/>
+          <w:sz w:val="24"/>
+          <w:szCs w:val="24"/>
+        </w:rPr>
+      </w:pPr>
+      <w:r>
+        <w:rPr>
+          <w:rFonts w:ascii="Cambria" w:hAnsi="Cambria"/>
+          <w:sz w:val="24"/>
+          <w:szCs w:val="24"/>
+        </w:rPr>
+        <w:t>]</w:t>
+      </w:r>
+    </w:p>
+    <w:p>
+      <w:pPr>
+        <w:rPr>
+          <w:rFonts w:ascii="Cambria" w:hAnsi="Cambria"/>
+          <w:sz w:val="24"/>
+          <w:szCs w:val="24"/>
+        </w:rPr>
+      </w:pPr>
+    </w:p>
+    <w:p>
+      <w:pPr>
+        <w:pStyle w:val="Paragraphedeliste"/>
+        <w:numPr>
+          <w:ilvl w:val="0"/>
+          <w:numId w:val="3"/>
+        </w:numPr>
+        <w:rPr>
+          <w:rFonts w:ascii="Cambria" w:hAnsi="Cambria"/>
+          <w:b/>
+          <w:bCs/>
+          <w:sz w:val="24"/>
+          <w:szCs w:val="24"/>
+        </w:rPr>
+      </w:pPr>
+      <w:r>
+        <w:rPr>
+          <w:rFonts w:ascii="Cambria" w:hAnsi="Cambria"/>
+          <w:b/>
+          <w:bCs/>
+        </w:rPr>
+        <w:t>GET /action/block-</w:t>
+      </w:r>
+      <w:proofErr w:type="spellStart"/>
+      <w:r>
+        <w:rPr>
+          <w:rFonts w:ascii="Cambria" w:hAnsi="Cambria"/>
+          <w:b/>
+          <w:bCs/>
+        </w:rPr>
+        <w:t>ip</w:t>
+      </w:r>
+      <w:proofErr w:type="spellEnd"/>
+    </w:p>
+    <w:p>
+      <w:pPr>
+        <w:rPr>
+          <w:rFonts w:ascii="Cambria" w:hAnsi="Cambria"/>
+          <w:sz w:val="24"/>
+          <w:szCs w:val="24"/>
+        </w:rPr>
+      </w:pPr>
+      <w:r>
+        <w:rPr>
+          <w:rFonts w:ascii="Cambria" w:hAnsi="Cambria"/>
+          <w:sz w:val="24"/>
+          <w:szCs w:val="24"/>
+        </w:rPr>
+        <w:t>[</w:t>
+      </w:r>
+    </w:p>
+    <w:p>
+      <w:pPr>
+        <w:rPr>
+          <w:rFonts w:ascii="Cambria" w:hAnsi="Cambria"/>
+          <w:sz w:val="24"/>
+          <w:szCs w:val="24"/>
+        </w:rPr>
+      </w:pPr>
+      <w:r>
+        <w:rPr>
+          <w:rFonts w:ascii="Cambria" w:hAnsi="Cambria"/>
+          <w:sz w:val="24"/>
+          <w:szCs w:val="24"/>
+        </w:rPr>
+        <w:t xml:space="preserve">  {</w:t>
+      </w:r>
+    </w:p>
+    <w:p>
+      <w:pPr>
+        <w:rPr>
+          <w:rFonts w:ascii="Cambria" w:hAnsi="Cambria"/>
+          <w:sz w:val="24"/>
+          <w:szCs w:val="24"/>
+        </w:rPr>
+      </w:pPr>
+      <w:r>
+        <w:rPr>
+          <w:rFonts w:ascii="Cambria" w:hAnsi="Cambria"/>
+          <w:sz w:val="24"/>
+          <w:szCs w:val="24"/>
+        </w:rPr>
+        <w:t xml:space="preserve">    "</w:t>
+      </w:r>
+      <w:proofErr w:type="spellStart"/>
+      <w:r>
+        <w:rPr>
+          <w:rFonts w:ascii="Cambria" w:hAnsi="Cambria"/>
+          <w:sz w:val="24"/>
+          <w:szCs w:val="24"/>
+        </w:rPr>
+        <w:t>command_id</w:t>
+      </w:r>
+      <w:proofErr w:type="spellEnd"/>
+      <w:proofErr w:type="gramStart"/>
+      <w:r>
+        <w:rPr>
+          <w:rFonts w:ascii="Cambria" w:hAnsi="Cambria"/>
+          <w:sz w:val="24"/>
+          <w:szCs w:val="24"/>
+        </w:rPr>
+        <w:t>":</w:t>
+      </w:r>
+      <w:proofErr w:type="gramEnd"/>
+      <w:r>
+        <w:rPr>
+          <w:rFonts w:ascii="Cambria" w:hAnsi="Cambria"/>
+          <w:sz w:val="24"/>
+          <w:szCs w:val="24"/>
+        </w:rPr>
+        <w:t xml:space="preserve"> "CMD-0002",</w:t>
+      </w:r>
+    </w:p>
+    <w:p>
+      <w:pPr>
+        <w:rPr>
+          <w:rFonts w:ascii="Cambria" w:hAnsi="Cambria"/>
+          <w:sz w:val="24"/>
+          <w:szCs w:val="24"/>
+        </w:rPr>
+      </w:pPr>
+      <w:r>
+        <w:rPr>
+          <w:rFonts w:ascii="Cambria" w:hAnsi="Cambria"/>
+          <w:sz w:val="24"/>
+          <w:szCs w:val="24"/>
+        </w:rPr>
+        <w:t xml:space="preserve">    "</w:t>
+      </w:r>
+      <w:proofErr w:type="spellStart"/>
+      <w:r>
+        <w:rPr>
+          <w:rFonts w:ascii="Cambria" w:hAnsi="Cambria"/>
+          <w:sz w:val="24"/>
+          <w:szCs w:val="24"/>
+        </w:rPr>
+        <w:t>agent_id</w:t>
+      </w:r>
+      <w:proofErr w:type="spellEnd"/>
+      <w:proofErr w:type="gramStart"/>
+      <w:r>
+        <w:rPr>
+          <w:rFonts w:ascii="Cambria" w:hAnsi="Cambria"/>
+          <w:sz w:val="24"/>
+          <w:szCs w:val="24"/>
+        </w:rPr>
+        <w:t>":</w:t>
+      </w:r>
+      <w:proofErr w:type="gramEnd"/>
+      <w:r>
+        <w:rPr>
+          <w:rFonts w:ascii="Cambria" w:hAnsi="Cambria"/>
+          <w:sz w:val="24"/>
+          <w:szCs w:val="24"/>
+        </w:rPr>
+        <w:t xml:space="preserve"> "AGENT-001",</w:t>
+      </w:r>
+    </w:p>
+    <w:p>
+      <w:pPr>
+        <w:rPr>
+          <w:rFonts w:ascii="Cambria" w:hAnsi="Cambria"/>
+          <w:sz w:val="24"/>
+          <w:szCs w:val="24"/>
+        </w:rPr>
+      </w:pPr>
+      <w:r>
+        <w:rPr>
+          <w:rFonts w:ascii="Cambria" w:hAnsi="Cambria"/>
+          <w:sz w:val="24"/>
+          <w:szCs w:val="24"/>
+        </w:rPr>
+        <w:t xml:space="preserve">    "</w:t>
+      </w:r>
+      <w:proofErr w:type="spellStart"/>
+      <w:r>
+        <w:rPr>
+          <w:rFonts w:ascii="Cambria" w:hAnsi="Cambria"/>
+          <w:sz w:val="24"/>
+          <w:szCs w:val="24"/>
+        </w:rPr>
+        <w:t>created_at</w:t>
+      </w:r>
+      <w:proofErr w:type="spellEnd"/>
+      <w:proofErr w:type="gramStart"/>
+      <w:r>
+        <w:rPr>
+          <w:rFonts w:ascii="Cambria" w:hAnsi="Cambria"/>
+          <w:sz w:val="24"/>
+          <w:szCs w:val="24"/>
+        </w:rPr>
+        <w:t>":</w:t>
+      </w:r>
+      <w:proofErr w:type="gramEnd"/>
+      <w:r>
+        <w:rPr>
+          <w:rFonts w:ascii="Cambria" w:hAnsi="Cambria"/>
+          <w:sz w:val="24"/>
+          <w:szCs w:val="24"/>
+        </w:rPr>
+        <w:t xml:space="preserve"> "2026-06-28T11:12:00Z",</w:t>
+      </w:r>
+    </w:p>
+    <w:p>
+      <w:pPr>
+        <w:rPr>
+          <w:rFonts w:ascii="Cambria" w:hAnsi="Cambria"/>
+          <w:sz w:val="24"/>
+          <w:szCs w:val="24"/>
+        </w:rPr>
+      </w:pPr>
+      <w:r>
+        <w:rPr>
+          <w:rFonts w:ascii="Cambria" w:hAnsi="Cambria"/>
+          <w:sz w:val="24"/>
+          <w:szCs w:val="24"/>
+        </w:rPr>
+        <w:t xml:space="preserve">    "</w:t>
+      </w:r>
+      <w:proofErr w:type="spellStart"/>
+      <w:r>
+        <w:rPr>
+          <w:rFonts w:ascii="Cambria" w:hAnsi="Cambria"/>
+          <w:sz w:val="24"/>
+          <w:szCs w:val="24"/>
+        </w:rPr>
+        <w:t>name</w:t>
+      </w:r>
+      <w:proofErr w:type="spellEnd"/>
+      <w:proofErr w:type="gramStart"/>
+      <w:r>
+        <w:rPr>
+          <w:rFonts w:ascii="Cambria" w:hAnsi="Cambria"/>
+          <w:sz w:val="24"/>
+          <w:szCs w:val="24"/>
+        </w:rPr>
+        <w:t>":</w:t>
+      </w:r>
+      <w:proofErr w:type="gramEnd"/>
+      <w:r>
+        <w:rPr>
+          <w:rFonts w:ascii="Cambria" w:hAnsi="Cambria"/>
+          <w:sz w:val="24"/>
+          <w:szCs w:val="24"/>
+        </w:rPr>
+        <w:t xml:space="preserve"> "Désactiver utilisateur",</w:t>
+      </w:r>
+    </w:p>
+    <w:p>
+      <w:pPr>
+        <w:rPr>
+          <w:rFonts w:ascii="Cambria" w:hAnsi="Cambria"/>
+          <w:sz w:val="24"/>
+          <w:szCs w:val="24"/>
+        </w:rPr>
+      </w:pPr>
+      <w:r>
+        <w:rPr>
+          <w:rFonts w:ascii="Cambria" w:hAnsi="Cambria"/>
+          <w:sz w:val="24"/>
+          <w:szCs w:val="24"/>
+        </w:rPr>
+        <w:t xml:space="preserve">    "description</w:t>
+      </w:r>
+      <w:proofErr w:type="gramStart"/>
+      <w:r>
+        <w:rPr>
+          <w:rFonts w:ascii="Cambria" w:hAnsi="Cambria"/>
+          <w:sz w:val="24"/>
+          <w:szCs w:val="24"/>
+        </w:rPr>
+        <w:t>":</w:t>
+      </w:r>
+      <w:proofErr w:type="gramEnd"/>
+      <w:r>
+        <w:rPr>
+          <w:rFonts w:ascii="Cambria" w:hAnsi="Cambria"/>
+          <w:sz w:val="24"/>
+          <w:szCs w:val="24"/>
+        </w:rPr>
+        <w:t xml:space="preserve"> "Compte compromis détecté",</w:t>
+      </w:r>
+    </w:p>
+    <w:p>
+      <w:pPr>
+        <w:rPr>
+          <w:rFonts w:ascii="Cambria" w:hAnsi="Cambria"/>
+          <w:sz w:val="24"/>
+          <w:szCs w:val="24"/>
+        </w:rPr>
+      </w:pPr>
+      <w:r>
+        <w:rPr>
+          <w:rFonts w:ascii="Cambria" w:hAnsi="Cambria"/>
+          <w:sz w:val="24"/>
+          <w:szCs w:val="24"/>
+        </w:rPr>
+        <w:t xml:space="preserve">    "</w:t>
+      </w:r>
+      <w:proofErr w:type="spellStart"/>
+      <w:r>
+        <w:rPr>
+          <w:rFonts w:ascii="Cambria" w:hAnsi="Cambria"/>
+          <w:sz w:val="24"/>
+          <w:szCs w:val="24"/>
+        </w:rPr>
+        <w:t>enabled</w:t>
+      </w:r>
+      <w:proofErr w:type="spellEnd"/>
+      <w:proofErr w:type="gramStart"/>
+      <w:r>
+        <w:rPr>
+          <w:rFonts w:ascii="Cambria" w:hAnsi="Cambria"/>
+          <w:sz w:val="24"/>
+          <w:szCs w:val="24"/>
+        </w:rPr>
+        <w:t>":</w:t>
+      </w:r>
+      <w:proofErr w:type="gramEnd"/>
+      <w:r>
+        <w:rPr>
+          <w:rFonts w:ascii="Cambria" w:hAnsi="Cambria"/>
+          <w:sz w:val="24"/>
+          <w:szCs w:val="24"/>
+        </w:rPr>
+        <w:t xml:space="preserve"> </w:t>
+      </w:r>
+      <w:proofErr w:type="spellStart"/>
+      <w:r>
+        <w:rPr>
+          <w:rFonts w:ascii="Cambria" w:hAnsi="Cambria"/>
+          <w:sz w:val="24"/>
+          <w:szCs w:val="24"/>
+        </w:rPr>
+        <w:t>true</w:t>
+      </w:r>
+      <w:proofErr w:type="spellEnd"/>
+      <w:r>
+        <w:rPr>
+          <w:rFonts w:ascii="Cambria" w:hAnsi="Cambria"/>
+          <w:sz w:val="24"/>
+          <w:szCs w:val="24"/>
+        </w:rPr>
+        <w:t>,</w:t>
+      </w:r>
+    </w:p>
+    <w:p>
+      <w:pPr>
+        <w:rPr>
+          <w:rFonts w:ascii="Cambria" w:hAnsi="Cambria"/>
+          <w:sz w:val="24"/>
+          <w:szCs w:val="24"/>
+        </w:rPr>
+      </w:pPr>
+      <w:r>
+        <w:rPr>
+          <w:rFonts w:ascii="Cambria" w:hAnsi="Cambria"/>
+          <w:sz w:val="24"/>
+          <w:szCs w:val="24"/>
+        </w:rPr>
+        <w:t xml:space="preserve">    "</w:t>
+      </w:r>
+      <w:proofErr w:type="spellStart"/>
+      <w:r>
+        <w:rPr>
+          <w:rFonts w:ascii="Cambria" w:hAnsi="Cambria"/>
+          <w:sz w:val="24"/>
+          <w:szCs w:val="24"/>
+        </w:rPr>
+        <w:t>steps</w:t>
+      </w:r>
+      <w:proofErr w:type="spellEnd"/>
+      <w:proofErr w:type="gramStart"/>
+      <w:r>
+        <w:rPr>
+          <w:rFonts w:ascii="Cambria" w:hAnsi="Cambria"/>
+          <w:sz w:val="24"/>
+          <w:szCs w:val="24"/>
+        </w:rPr>
+        <w:t>":</w:t>
+      </w:r>
+      <w:proofErr w:type="gramEnd"/>
+      <w:r>
+        <w:rPr>
+          <w:rFonts w:ascii="Cambria" w:hAnsi="Cambria"/>
+          <w:sz w:val="24"/>
+          <w:szCs w:val="24"/>
+        </w:rPr>
+        <w:t xml:space="preserve"> [</w:t>
+      </w:r>
+    </w:p>
+    <w:p>
+      <w:pPr>
+        <w:rPr>
+          <w:rFonts w:ascii="Cambria" w:hAnsi="Cambria"/>
+          <w:sz w:val="24"/>
+          <w:szCs w:val="24"/>
+        </w:rPr>
+      </w:pPr>
+      <w:r>
+        <w:rPr>
+          <w:rFonts w:ascii="Cambria" w:hAnsi="Cambria"/>
+          <w:sz w:val="24"/>
+          <w:szCs w:val="24"/>
+        </w:rPr>
+        <w:t xml:space="preserve">      {</w:t>
+      </w:r>
+    </w:p>
+    <w:p>
+      <w:pPr>
+        <w:rPr>
+          <w:rFonts w:ascii="Cambria" w:hAnsi="Cambria"/>
+          <w:sz w:val="24"/>
+          <w:szCs w:val="24"/>
+        </w:rPr>
+      </w:pPr>
+      <w:r>
+        <w:rPr>
+          <w:rFonts w:ascii="Cambria" w:hAnsi="Cambria"/>
+          <w:sz w:val="24"/>
+          <w:szCs w:val="24"/>
+        </w:rPr>
+        <w:t xml:space="preserve">        "action</w:t>
+      </w:r>
+      <w:proofErr w:type="gramStart"/>
+      <w:r>
+        <w:rPr>
+          <w:rFonts w:ascii="Cambria" w:hAnsi="Cambria"/>
+          <w:sz w:val="24"/>
+          <w:szCs w:val="24"/>
+        </w:rPr>
+        <w:t>":</w:t>
+      </w:r>
+      <w:proofErr w:type="gramEnd"/>
+      <w:r>
+        <w:rPr>
+          <w:rFonts w:ascii="Cambria" w:hAnsi="Cambria"/>
+          <w:sz w:val="24"/>
+          <w:szCs w:val="24"/>
+        </w:rPr>
+        <w:t xml:space="preserve"> "</w:t>
+      </w:r>
+      <w:proofErr w:type="spellStart"/>
+      <w:r>
+        <w:rPr>
+          <w:rFonts w:ascii="Cambria" w:hAnsi="Cambria"/>
+          <w:sz w:val="24"/>
+          <w:szCs w:val="24"/>
+        </w:rPr>
+        <w:t>disable_user</w:t>
+      </w:r>
+      <w:proofErr w:type="spellEnd"/>
+      <w:r>
+        <w:rPr>
+          <w:rFonts w:ascii="Cambria" w:hAnsi="Cambria"/>
+          <w:sz w:val="24"/>
+          <w:szCs w:val="24"/>
+        </w:rPr>
+        <w:t>",</w:t>
+      </w:r>
+    </w:p>
+    <w:p>
+      <w:pPr>
+        <w:rPr>
+          <w:rFonts w:ascii="Cambria" w:hAnsi="Cambria"/>
+          <w:sz w:val="24"/>
+          <w:szCs w:val="24"/>
+        </w:rPr>
+      </w:pPr>
+      <w:r>
+        <w:rPr>
+          <w:rFonts w:ascii="Cambria" w:hAnsi="Cambria"/>
+          <w:sz w:val="24"/>
+          <w:szCs w:val="24"/>
+        </w:rPr>
+        <w:t xml:space="preserve">        "params</w:t>
+      </w:r>
+      <w:proofErr w:type="gramStart"/>
+      <w:r>
+        <w:rPr>
+          <w:rFonts w:ascii="Cambria" w:hAnsi="Cambria"/>
+          <w:sz w:val="24"/>
+          <w:szCs w:val="24"/>
+        </w:rPr>
+        <w:t>":</w:t>
+      </w:r>
+      <w:proofErr w:type="gramEnd"/>
+      <w:r>
+        <w:rPr>
+          <w:rFonts w:ascii="Cambria" w:hAnsi="Cambria"/>
+          <w:sz w:val="24"/>
+          <w:szCs w:val="24"/>
+        </w:rPr>
+        <w:t xml:space="preserve"> {</w:t>
+      </w:r>
+    </w:p>
+    <w:p>
+      <w:pPr>
+        <w:rPr>
+          <w:rFonts w:ascii="Cambria" w:hAnsi="Cambria"/>
+          <w:sz w:val="24"/>
+          <w:szCs w:val="24"/>
+        </w:rPr>
+      </w:pPr>
+      <w:r>
+        <w:rPr>
+          <w:rFonts w:ascii="Cambria" w:hAnsi="Cambria"/>
+          <w:sz w:val="24"/>
+          <w:szCs w:val="24"/>
+        </w:rPr>
+        <w:t xml:space="preserve">          "</w:t>
+      </w:r>
+      <w:proofErr w:type="spellStart"/>
+      <w:r>
+        <w:rPr>
+          <w:rFonts w:ascii="Cambria" w:hAnsi="Cambria"/>
+          <w:sz w:val="24"/>
+          <w:szCs w:val="24"/>
+        </w:rPr>
+        <w:t>username</w:t>
+      </w:r>
+      <w:proofErr w:type="spellEnd"/>
+      <w:proofErr w:type="gramStart"/>
+      <w:r>
+        <w:rPr>
+          <w:rFonts w:ascii="Cambria" w:hAnsi="Cambria"/>
+          <w:sz w:val="24"/>
+          <w:szCs w:val="24"/>
+        </w:rPr>
+        <w:t>":</w:t>
+      </w:r>
+      <w:proofErr w:type="gramEnd"/>
+      <w:r>
+        <w:rPr>
+          <w:rFonts w:ascii="Cambria" w:hAnsi="Cambria"/>
+          <w:sz w:val="24"/>
+          <w:szCs w:val="24"/>
+        </w:rPr>
+        <w:t xml:space="preserve"> "</w:t>
+      </w:r>
+      <w:proofErr w:type="spellStart"/>
+      <w:r>
+        <w:rPr>
+          <w:rFonts w:ascii="Cambria" w:hAnsi="Cambria"/>
+          <w:sz w:val="24"/>
+          <w:szCs w:val="24"/>
+        </w:rPr>
+        <w:t>john.doe</w:t>
+      </w:r>
+      <w:proofErr w:type="spellEnd"/>
+      <w:r>
+        <w:rPr>
+          <w:rFonts w:ascii="Cambria" w:hAnsi="Cambria"/>
+          <w:sz w:val="24"/>
+          <w:szCs w:val="24"/>
+        </w:rPr>
+        <w:t>",</w:t>
+      </w:r>
+    </w:p>
+    <w:p>
+      <w:pPr>
+        <w:rPr>
+          <w:rFonts w:ascii="Cambria" w:hAnsi="Cambria"/>
+          <w:sz w:val="24"/>
+          <w:szCs w:val="24"/>
+        </w:rPr>
+      </w:pPr>
+      <w:r>
+        <w:rPr>
+          <w:rFonts w:ascii="Cambria" w:hAnsi="Cambria"/>
+          <w:sz w:val="24"/>
+          <w:szCs w:val="24"/>
+        </w:rPr>
+        <w:t xml:space="preserve">          "</w:t>
+      </w:r>
+      <w:proofErr w:type="spellStart"/>
+      <w:r>
+        <w:rPr>
+          <w:rFonts w:ascii="Cambria" w:hAnsi="Cambria"/>
+          <w:sz w:val="24"/>
+          <w:szCs w:val="24"/>
+        </w:rPr>
+        <w:t>reason</w:t>
+      </w:r>
+      <w:proofErr w:type="spellEnd"/>
+      <w:proofErr w:type="gramStart"/>
+      <w:r>
+        <w:rPr>
+          <w:rFonts w:ascii="Cambria" w:hAnsi="Cambria"/>
+          <w:sz w:val="24"/>
+          <w:szCs w:val="24"/>
+        </w:rPr>
+        <w:t>":</w:t>
+      </w:r>
+      <w:proofErr w:type="gramEnd"/>
+      <w:r>
+        <w:rPr>
+          <w:rFonts w:ascii="Cambria" w:hAnsi="Cambria"/>
+          <w:sz w:val="24"/>
+          <w:szCs w:val="24"/>
+        </w:rPr>
+        <w:t xml:space="preserve"> "Connexion depuis plusieurs pays"</w:t>
+      </w:r>
+    </w:p>
+    <w:p>
+      <w:pPr>
+        <w:rPr>
+          <w:rFonts w:ascii="Cambria" w:hAnsi="Cambria"/>
+          <w:sz w:val="24"/>
+          <w:szCs w:val="24"/>
+        </w:rPr>
+      </w:pPr>
+      <w:r>
+        <w:rPr>
+          <w:rFonts w:ascii="Cambria" w:hAnsi="Cambria"/>
+          <w:sz w:val="24"/>
+          <w:szCs w:val="24"/>
+        </w:rPr>
+        <w:t xml:space="preserve">        }</w:t>
+      </w:r>
+    </w:p>
+    <w:p>
+      <w:pPr>
+        <w:rPr>
+          <w:rFonts w:ascii="Cambria" w:hAnsi="Cambria"/>
+          <w:sz w:val="24"/>
+          <w:szCs w:val="24"/>
+        </w:rPr>
+      </w:pPr>
+      <w:r>
+        <w:rPr>
+          <w:rFonts w:ascii="Cambria" w:hAnsi="Cambria"/>
+          <w:sz w:val="24"/>
+          <w:szCs w:val="24"/>
+        </w:rPr>
+        <w:t xml:space="preserve">      }</w:t>
+      </w:r>
+    </w:p>
+    <w:p>
+      <w:pPr>
+        <w:rPr>
+          <w:rFonts w:ascii="Cambria" w:hAnsi="Cambria"/>
+          <w:sz w:val="24"/>
+          <w:szCs w:val="24"/>
+        </w:rPr>
+      </w:pPr>
+      <w:r>
+        <w:rPr>
+          <w:rFonts w:ascii="Cambria" w:hAnsi="Cambria"/>
+          <w:sz w:val="24"/>
+          <w:szCs w:val="24"/>
+        </w:rPr>
+        <w:t xml:space="preserve">    ],</w:t>
+      </w:r>
+    </w:p>
+    <w:p>
+      <w:pPr>
+        <w:rPr>
+          <w:rFonts w:ascii="Cambria" w:hAnsi="Cambria"/>
+          <w:sz w:val="24"/>
+          <w:szCs w:val="24"/>
+        </w:rPr>
+      </w:pPr>
+      <w:r>
+        <w:rPr>
+          <w:rFonts w:ascii="Cambria" w:hAnsi="Cambria"/>
+          <w:sz w:val="24"/>
+          <w:szCs w:val="24"/>
+        </w:rPr>
+        <w:t xml:space="preserve">    "</w:t>
+      </w:r>
+      <w:proofErr w:type="spellStart"/>
+      <w:r>
+        <w:rPr>
+          <w:rFonts w:ascii="Cambria" w:hAnsi="Cambria"/>
+          <w:sz w:val="24"/>
+          <w:szCs w:val="24"/>
+        </w:rPr>
+        <w:t>timeout_seconds</w:t>
+      </w:r>
+      <w:proofErr w:type="spellEnd"/>
+      <w:proofErr w:type="gramStart"/>
+      <w:r>
+        <w:rPr>
+          <w:rFonts w:ascii="Cambria" w:hAnsi="Cambria"/>
+          <w:sz w:val="24"/>
+          <w:szCs w:val="24"/>
+        </w:rPr>
+        <w:t>":</w:t>
+      </w:r>
+      <w:proofErr w:type="gramEnd"/>
+      <w:r>
+        <w:rPr>
+          <w:rFonts w:ascii="Cambria" w:hAnsi="Cambria"/>
+          <w:sz w:val="24"/>
+          <w:szCs w:val="24"/>
+        </w:rPr>
+        <w:t xml:space="preserve"> 120,</w:t>
+      </w:r>
+    </w:p>
+    <w:p>
+      <w:pPr>
+        <w:rPr>
+          <w:rFonts w:ascii="Cambria" w:hAnsi="Cambria"/>
+          <w:sz w:val="24"/>
+          <w:szCs w:val="24"/>
+        </w:rPr>
+      </w:pPr>
+      <w:r>
+        <w:rPr>
+          <w:rFonts w:ascii="Cambria" w:hAnsi="Cambria"/>
+          <w:sz w:val="24"/>
+          <w:szCs w:val="24"/>
+        </w:rPr>
+        <w:t xml:space="preserve">    "</w:t>
+      </w:r>
+      <w:proofErr w:type="spellStart"/>
+      <w:r>
+        <w:rPr>
+          <w:rFonts w:ascii="Cambria" w:hAnsi="Cambria"/>
+          <w:sz w:val="24"/>
+          <w:szCs w:val="24"/>
+        </w:rPr>
+        <w:t>max_retries</w:t>
+      </w:r>
+      <w:proofErr w:type="spellEnd"/>
+      <w:proofErr w:type="gramStart"/>
+      <w:r>
+        <w:rPr>
+          <w:rFonts w:ascii="Cambria" w:hAnsi="Cambria"/>
+          <w:sz w:val="24"/>
+          <w:szCs w:val="24"/>
+        </w:rPr>
+        <w:t>":</w:t>
+      </w:r>
+      <w:proofErr w:type="gramEnd"/>
+      <w:r>
+        <w:rPr>
+          <w:rFonts w:ascii="Cambria" w:hAnsi="Cambria"/>
+          <w:sz w:val="24"/>
+          <w:szCs w:val="24"/>
+        </w:rPr>
+        <w:t xml:space="preserve"> 2</w:t>
+      </w:r>
+    </w:p>
+    <w:p>
+      <w:pPr>
+        <w:rPr>
+          <w:rFonts w:ascii="Cambria" w:hAnsi="Cambria"/>
+          <w:sz w:val="24"/>
+          <w:szCs w:val="24"/>
+        </w:rPr>
+      </w:pPr>
+      <w:r>
+        <w:rPr>
+          <w:rFonts w:ascii="Cambria" w:hAnsi="Cambria"/>
+          <w:sz w:val="24"/>
+          <w:szCs w:val="24"/>
+        </w:rPr>
+        <w:t xml:space="preserve">  }</w:t>
+      </w:r>
+    </w:p>
+    <w:p>
+      <w:pPr>
+        <w:rPr>
+          <w:rFonts w:ascii="Cambria" w:hAnsi="Cambria"/>
+          <w:sz w:val="24"/>
+          <w:szCs w:val="24"/>
+        </w:rPr>
+      </w:pPr>
+      <w:r>
+        <w:rPr>
+          <w:rFonts w:ascii="Cambria" w:hAnsi="Cambria"/>
+          <w:sz w:val="24"/>
+          <w:szCs w:val="24"/>
+        </w:rPr>
+        <w:t>]</w:t>
+      </w:r>
+    </w:p>
+    <w:p>
+      <w:pPr>
+        <w:rPr>
+          <w:rFonts w:ascii="Cambria" w:hAnsi="Cambria"/>
+          <w:sz w:val="24"/>
+          <w:szCs w:val="24"/>
+        </w:rPr>
+      </w:pPr>
+    </w:p>
+    <w:p>
+      <w:pPr>
+        <w:pStyle w:val="Paragraphedeliste"/>
+        <w:numPr>
+          <w:ilvl w:val="0"/>
+          <w:numId w:val="4"/>
+        </w:numPr>
+        <w:rPr>
+          <w:rFonts w:ascii="Cambria" w:hAnsi="Cambria"/>
+          <w:b/>
+          <w:bCs/>
+          <w:sz w:val="24"/>
+          <w:szCs w:val="24"/>
+        </w:rPr>
+      </w:pPr>
+      <w:r>
+        <w:rPr>
+          <w:rFonts w:ascii="Cambria" w:hAnsi="Cambria"/>
+          <w:b/>
+          <w:bCs/>
+        </w:rPr>
+        <w:t>GET /action/</w:t>
+      </w:r>
+      <w:proofErr w:type="spellStart"/>
+      <w:r>
+        <w:rPr>
+          <w:rFonts w:ascii="Cambria" w:hAnsi="Cambria"/>
+          <w:b/>
+          <w:bCs/>
+        </w:rPr>
+        <w:t>isolate</w:t>
+      </w:r>
+      <w:proofErr w:type="spellEnd"/>
+      <w:r>
+        <w:rPr>
+          <w:rFonts w:ascii="Cambria" w:hAnsi="Cambria"/>
+          <w:b/>
+          <w:bCs/>
+        </w:rPr>
+        <w:t>-host</w:t>
+      </w:r>
+    </w:p>
+    <w:p>
+      <w:pPr>
+        <w:rPr>
+          <w:rFonts w:ascii="Cambria" w:hAnsi="Cambria"/>
+          <w:sz w:val="24"/>
+          <w:szCs w:val="24"/>
+        </w:rPr>
+      </w:pPr>
+      <w:r>
+        <w:rPr>
+          <w:rFonts w:ascii="Cambria" w:hAnsi="Cambria"/>
+          <w:sz w:val="24"/>
+          <w:szCs w:val="24"/>
+        </w:rPr>
+        <w:lastRenderedPageBreak/>
+        <w:t>[</w:t>
+      </w:r>
+    </w:p>
+    <w:p>
+      <w:pPr>
+        <w:rPr>
+          <w:rFonts w:ascii="Cambria" w:hAnsi="Cambria"/>
+          <w:sz w:val="24"/>
+          <w:szCs w:val="24"/>
+        </w:rPr>
+      </w:pPr>
+      <w:r>
+        <w:rPr>
+          <w:rFonts w:ascii="Cambria" w:hAnsi="Cambria"/>
+          <w:sz w:val="24"/>
+          <w:szCs w:val="24"/>
+        </w:rPr>
+        <w:t xml:space="preserve">  {</w:t>
+      </w:r>
+    </w:p>
+    <w:p>
+      <w:pPr>
+        <w:rPr>
+          <w:rFonts w:ascii="Cambria" w:hAnsi="Cambria"/>
+          <w:sz w:val="24"/>
+          <w:szCs w:val="24"/>
+        </w:rPr>
+      </w:pPr>
+      <w:r>
+        <w:rPr>
+          <w:rFonts w:ascii="Cambria" w:hAnsi="Cambria"/>
+          <w:sz w:val="24"/>
+          <w:szCs w:val="24"/>
+        </w:rPr>
+        <w:t xml:space="preserve">    "</w:t>
+      </w:r>
+      <w:proofErr w:type="spellStart"/>
+      <w:r>
+        <w:rPr>
+          <w:rFonts w:ascii="Cambria" w:hAnsi="Cambria"/>
+          <w:sz w:val="24"/>
+          <w:szCs w:val="24"/>
+        </w:rPr>
+        <w:t>command_id</w:t>
+      </w:r>
+      <w:proofErr w:type="spellEnd"/>
+      <w:proofErr w:type="gramStart"/>
+      <w:r>
+        <w:rPr>
+          <w:rFonts w:ascii="Cambria" w:hAnsi="Cambria"/>
+          <w:sz w:val="24"/>
+          <w:szCs w:val="24"/>
+        </w:rPr>
+        <w:t>":</w:t>
+      </w:r>
+      <w:proofErr w:type="gramEnd"/>
+      <w:r>
+        <w:rPr>
+          <w:rFonts w:ascii="Cambria" w:hAnsi="Cambria"/>
+          <w:sz w:val="24"/>
+          <w:szCs w:val="24"/>
+        </w:rPr>
+        <w:t xml:space="preserve"> "CMD-0003",</w:t>
+      </w:r>
+    </w:p>
+    <w:p>
+      <w:pPr>
+        <w:rPr>
+          <w:rFonts w:ascii="Cambria" w:hAnsi="Cambria"/>
+          <w:sz w:val="24"/>
+          <w:szCs w:val="24"/>
+        </w:rPr>
+      </w:pPr>
+      <w:r>
+        <w:rPr>
+          <w:rFonts w:ascii="Cambria" w:hAnsi="Cambria"/>
+          <w:sz w:val="24"/>
+          <w:szCs w:val="24"/>
+        </w:rPr>
+        <w:t xml:space="preserve">    "</w:t>
+      </w:r>
+      <w:proofErr w:type="spellStart"/>
+      <w:r>
+        <w:rPr>
+          <w:rFonts w:ascii="Cambria" w:hAnsi="Cambria"/>
+          <w:sz w:val="24"/>
+          <w:szCs w:val="24"/>
+        </w:rPr>
+        <w:t>agent_id</w:t>
+      </w:r>
+      <w:proofErr w:type="spellEnd"/>
+      <w:proofErr w:type="gramStart"/>
+      <w:r>
+        <w:rPr>
+          <w:rFonts w:ascii="Cambria" w:hAnsi="Cambria"/>
+          <w:sz w:val="24"/>
+          <w:szCs w:val="24"/>
+        </w:rPr>
+        <w:t>":</w:t>
+      </w:r>
+      <w:proofErr w:type="gramEnd"/>
+      <w:r>
+        <w:rPr>
+          <w:rFonts w:ascii="Cambria" w:hAnsi="Cambria"/>
+          <w:sz w:val="24"/>
+          <w:szCs w:val="24"/>
+        </w:rPr>
+        <w:t xml:space="preserve"> "AGENT-001",</w:t>
+      </w:r>
+    </w:p>
+    <w:p>
+      <w:pPr>
+        <w:rPr>
+          <w:rFonts w:ascii="Cambria" w:hAnsi="Cambria"/>
+          <w:sz w:val="24"/>
+          <w:szCs w:val="24"/>
+        </w:rPr>
+      </w:pPr>
+      <w:r>
+        <w:rPr>
+          <w:rFonts w:ascii="Cambria" w:hAnsi="Cambria"/>
+          <w:sz w:val="24"/>
+          <w:szCs w:val="24"/>
+        </w:rPr>
+        <w:t xml:space="preserve">    "</w:t>
+      </w:r>
+      <w:proofErr w:type="spellStart"/>
+      <w:r>
+        <w:rPr>
+          <w:rFonts w:ascii="Cambria" w:hAnsi="Cambria"/>
+          <w:sz w:val="24"/>
+          <w:szCs w:val="24"/>
+        </w:rPr>
+        <w:t>created_at</w:t>
+      </w:r>
+      <w:proofErr w:type="spellEnd"/>
+      <w:proofErr w:type="gramStart"/>
+      <w:r>
+        <w:rPr>
+          <w:rFonts w:ascii="Cambria" w:hAnsi="Cambria"/>
+          <w:sz w:val="24"/>
+          <w:szCs w:val="24"/>
+        </w:rPr>
+        <w:t>":</w:t>
+      </w:r>
+      <w:proofErr w:type="gramEnd"/>
+      <w:r>
+        <w:rPr>
+          <w:rFonts w:ascii="Cambria" w:hAnsi="Cambria"/>
+          <w:sz w:val="24"/>
+          <w:szCs w:val="24"/>
+        </w:rPr>
+        <w:t xml:space="preserve"> "2026-06-28T11:15:00Z",</w:t>
+      </w:r>
+    </w:p>
+    <w:p>
+      <w:pPr>
+        <w:rPr>
+          <w:rFonts w:ascii="Cambria" w:hAnsi="Cambria"/>
+          <w:sz w:val="24"/>
+          <w:szCs w:val="24"/>
+        </w:rPr>
+      </w:pPr>
+      <w:r>
+        <w:rPr>
+          <w:rFonts w:ascii="Cambria" w:hAnsi="Cambria"/>
+          <w:sz w:val="24"/>
+          <w:szCs w:val="24"/>
+        </w:rPr>
+        <w:t xml:space="preserve">    "</w:t>
+      </w:r>
+      <w:proofErr w:type="spellStart"/>
+      <w:r>
+        <w:rPr>
+          <w:rFonts w:ascii="Cambria" w:hAnsi="Cambria"/>
+          <w:sz w:val="24"/>
+          <w:szCs w:val="24"/>
+        </w:rPr>
+        <w:t>name</w:t>
+      </w:r>
+      <w:proofErr w:type="spellEnd"/>
+      <w:proofErr w:type="gramStart"/>
+      <w:r>
+        <w:rPr>
+          <w:rFonts w:ascii="Cambria" w:hAnsi="Cambria"/>
+          <w:sz w:val="24"/>
+          <w:szCs w:val="24"/>
+        </w:rPr>
+        <w:t>":</w:t>
+      </w:r>
+      <w:proofErr w:type="gramEnd"/>
+      <w:r>
+        <w:rPr>
+          <w:rFonts w:ascii="Cambria" w:hAnsi="Cambria"/>
+          <w:sz w:val="24"/>
+          <w:szCs w:val="24"/>
+        </w:rPr>
+        <w:t xml:space="preserve"> "Isolation de la machine",</w:t>
+      </w:r>
+    </w:p>
+    <w:p>
+      <w:pPr>
+        <w:rPr>
+          <w:rFonts w:ascii="Cambria" w:hAnsi="Cambria"/>
+          <w:sz w:val="24"/>
+          <w:szCs w:val="24"/>
+        </w:rPr>
+      </w:pPr>
+      <w:r>
+        <w:rPr>
+          <w:rFonts w:ascii="Cambria" w:hAnsi="Cambria"/>
+          <w:sz w:val="24"/>
+          <w:szCs w:val="24"/>
+        </w:rPr>
+        <w:t xml:space="preserve">    "description</w:t>
+      </w:r>
+      <w:proofErr w:type="gramStart"/>
+      <w:r>
+        <w:rPr>
+          <w:rFonts w:ascii="Cambria" w:hAnsi="Cambria"/>
+          <w:sz w:val="24"/>
+          <w:szCs w:val="24"/>
+        </w:rPr>
+        <w:t>":</w:t>
+      </w:r>
+      <w:proofErr w:type="gramEnd"/>
+      <w:r>
+        <w:rPr>
+          <w:rFonts w:ascii="Cambria" w:hAnsi="Cambria"/>
+          <w:sz w:val="24"/>
+          <w:szCs w:val="24"/>
+        </w:rPr>
+        <w:t xml:space="preserve"> "Ransomware détecté",</w:t>
+      </w:r>
+    </w:p>
+    <w:p>
+      <w:pPr>
+        <w:rPr>
+          <w:rFonts w:ascii="Cambria" w:hAnsi="Cambria"/>
+          <w:sz w:val="24"/>
+          <w:szCs w:val="24"/>
+        </w:rPr>
+      </w:pPr>
+      <w:r>
+        <w:rPr>
+          <w:rFonts w:ascii="Cambria" w:hAnsi="Cambria"/>
+          <w:sz w:val="24"/>
+          <w:szCs w:val="24"/>
+        </w:rPr>
+        <w:t xml:space="preserve">    "</w:t>
+      </w:r>
+      <w:proofErr w:type="spellStart"/>
+      <w:r>
+        <w:rPr>
+          <w:rFonts w:ascii="Cambria" w:hAnsi="Cambria"/>
+          <w:sz w:val="24"/>
+          <w:szCs w:val="24"/>
+        </w:rPr>
+        <w:t>enabled</w:t>
+      </w:r>
+      <w:proofErr w:type="spellEnd"/>
+      <w:proofErr w:type="gramStart"/>
+      <w:r>
+        <w:rPr>
+          <w:rFonts w:ascii="Cambria" w:hAnsi="Cambria"/>
+          <w:sz w:val="24"/>
+          <w:szCs w:val="24"/>
+        </w:rPr>
+        <w:t>":</w:t>
+      </w:r>
+      <w:proofErr w:type="gramEnd"/>
+      <w:r>
+        <w:rPr>
+          <w:rFonts w:ascii="Cambria" w:hAnsi="Cambria"/>
+          <w:sz w:val="24"/>
+          <w:szCs w:val="24"/>
+        </w:rPr>
+        <w:t xml:space="preserve"> </w:t>
+      </w:r>
+      <w:proofErr w:type="spellStart"/>
+      <w:r>
+        <w:rPr>
+          <w:rFonts w:ascii="Cambria" w:hAnsi="Cambria"/>
+          <w:sz w:val="24"/>
+          <w:szCs w:val="24"/>
+        </w:rPr>
+        <w:t>true</w:t>
+      </w:r>
+      <w:proofErr w:type="spellEnd"/>
+      <w:r>
+        <w:rPr>
+          <w:rFonts w:ascii="Cambria" w:hAnsi="Cambria"/>
+          <w:sz w:val="24"/>
+          <w:szCs w:val="24"/>
+        </w:rPr>
+        <w:t>,</w:t>
+      </w:r>
+    </w:p>
+    <w:p>
+      <w:pPr>
+        <w:rPr>
+          <w:rFonts w:ascii="Cambria" w:hAnsi="Cambria"/>
+          <w:sz w:val="24"/>
+          <w:szCs w:val="24"/>
+        </w:rPr>
+      </w:pPr>
+      <w:r>
+        <w:rPr>
+          <w:rFonts w:ascii="Cambria" w:hAnsi="Cambria"/>
+          <w:sz w:val="24"/>
+          <w:szCs w:val="24"/>
+        </w:rPr>
+        <w:t xml:space="preserve">    "</w:t>
+      </w:r>
+      <w:proofErr w:type="spellStart"/>
+      <w:r>
+        <w:rPr>
+          <w:rFonts w:ascii="Cambria" w:hAnsi="Cambria"/>
+          <w:sz w:val="24"/>
+          <w:szCs w:val="24"/>
+        </w:rPr>
+        <w:t>steps</w:t>
+      </w:r>
+      <w:proofErr w:type="spellEnd"/>
+      <w:proofErr w:type="gramStart"/>
+      <w:r>
+        <w:rPr>
+          <w:rFonts w:ascii="Cambria" w:hAnsi="Cambria"/>
+          <w:sz w:val="24"/>
+          <w:szCs w:val="24"/>
+        </w:rPr>
+        <w:t>":</w:t>
+      </w:r>
+      <w:proofErr w:type="gramEnd"/>
+      <w:r>
+        <w:rPr>
+          <w:rFonts w:ascii="Cambria" w:hAnsi="Cambria"/>
+          <w:sz w:val="24"/>
+          <w:szCs w:val="24"/>
+        </w:rPr>
+        <w:t xml:space="preserve"> [</w:t>
+      </w:r>
+    </w:p>
+    <w:p>
+      <w:pPr>
+        <w:rPr>
+          <w:rFonts w:ascii="Cambria" w:hAnsi="Cambria"/>
+          <w:sz w:val="24"/>
+          <w:szCs w:val="24"/>
+        </w:rPr>
+      </w:pPr>
+      <w:r>
+        <w:rPr>
+          <w:rFonts w:ascii="Cambria" w:hAnsi="Cambria"/>
+          <w:sz w:val="24"/>
+          <w:szCs w:val="24"/>
+        </w:rPr>
+        <w:t xml:space="preserve">      {</w:t>
+      </w:r>
+    </w:p>
+    <w:p>
+      <w:pPr>
+        <w:rPr>
+          <w:rFonts w:ascii="Cambria" w:hAnsi="Cambria"/>
+          <w:sz w:val="24"/>
+          <w:szCs w:val="24"/>
+        </w:rPr>
+      </w:pPr>
+      <w:r>
+        <w:rPr>
+          <w:rFonts w:ascii="Cambria" w:hAnsi="Cambria"/>
+          <w:sz w:val="24"/>
+          <w:szCs w:val="24"/>
+        </w:rPr>
+        <w:t xml:space="preserve">        "action</w:t>
+      </w:r>
+      <w:proofErr w:type="gramStart"/>
+      <w:r>
+        <w:rPr>
+          <w:rFonts w:ascii="Cambria" w:hAnsi="Cambria"/>
+          <w:sz w:val="24"/>
+          <w:szCs w:val="24"/>
+        </w:rPr>
+        <w:t>":</w:t>
+      </w:r>
+      <w:proofErr w:type="gramEnd"/>
+      <w:r>
+        <w:rPr>
+          <w:rFonts w:ascii="Cambria" w:hAnsi="Cambria"/>
+          <w:sz w:val="24"/>
+          <w:szCs w:val="24"/>
+        </w:rPr>
+        <w:t xml:space="preserve"> "</w:t>
+      </w:r>
+      <w:proofErr w:type="spellStart"/>
+      <w:r>
+        <w:rPr>
+          <w:rFonts w:ascii="Cambria" w:hAnsi="Cambria"/>
+          <w:sz w:val="24"/>
+          <w:szCs w:val="24"/>
+        </w:rPr>
+        <w:t>isolate_host</w:t>
+      </w:r>
+      <w:proofErr w:type="spellEnd"/>
+      <w:r>
+        <w:rPr>
+          <w:rFonts w:ascii="Cambria" w:hAnsi="Cambria"/>
+          <w:sz w:val="24"/>
+          <w:szCs w:val="24"/>
+        </w:rPr>
+        <w:t>",</w:t>
+      </w:r>
+    </w:p>
+    <w:p>
+      <w:pPr>
+        <w:rPr>
+          <w:rFonts w:ascii="Cambria" w:hAnsi="Cambria"/>
+          <w:sz w:val="24"/>
+          <w:szCs w:val="24"/>
+        </w:rPr>
+      </w:pPr>
+      <w:r>
+        <w:rPr>
+          <w:rFonts w:ascii="Cambria" w:hAnsi="Cambria"/>
+          <w:sz w:val="24"/>
+          <w:szCs w:val="24"/>
+        </w:rPr>
+        <w:t xml:space="preserve">        "params</w:t>
+      </w:r>
+      <w:proofErr w:type="gramStart"/>
+      <w:r>
+        <w:rPr>
+          <w:rFonts w:ascii="Cambria" w:hAnsi="Cambria"/>
+          <w:sz w:val="24"/>
+          <w:szCs w:val="24"/>
+        </w:rPr>
+        <w:t>":</w:t>
+      </w:r>
+      <w:proofErr w:type="gramEnd"/>
+      <w:r>
+        <w:rPr>
+          <w:rFonts w:ascii="Cambria" w:hAnsi="Cambria"/>
+          <w:sz w:val="24"/>
+          <w:szCs w:val="24"/>
+        </w:rPr>
+        <w:t xml:space="preserve"> {</w:t>
+      </w:r>
+    </w:p>
+    <w:p>
+      <w:pPr>
+        <w:rPr>
+          <w:rFonts w:ascii="Cambria" w:hAnsi="Cambria"/>
+          <w:sz w:val="24"/>
+          <w:szCs w:val="24"/>
+        </w:rPr>
+      </w:pPr>
+      <w:r>
+        <w:rPr>
+          <w:rFonts w:ascii="Cambria" w:hAnsi="Cambria"/>
+          <w:sz w:val="24"/>
+          <w:szCs w:val="24"/>
+        </w:rPr>
+        <w:t xml:space="preserve">          "</w:t>
+      </w:r>
+      <w:proofErr w:type="spellStart"/>
+      <w:r>
+        <w:rPr>
+          <w:rFonts w:ascii="Cambria" w:hAnsi="Cambria"/>
+          <w:sz w:val="24"/>
+          <w:szCs w:val="24"/>
+        </w:rPr>
+        <w:t>siem_ip</w:t>
+      </w:r>
+      <w:proofErr w:type="spellEnd"/>
+      <w:proofErr w:type="gramStart"/>
+      <w:r>
+        <w:rPr>
+          <w:rFonts w:ascii="Cambria" w:hAnsi="Cambria"/>
+          <w:sz w:val="24"/>
+          <w:szCs w:val="24"/>
+        </w:rPr>
+        <w:t>":</w:t>
+      </w:r>
+      <w:proofErr w:type="gramEnd"/>
+      <w:r>
+        <w:rPr>
+          <w:rFonts w:ascii="Cambria" w:hAnsi="Cambria"/>
+          <w:sz w:val="24"/>
+          <w:szCs w:val="24"/>
+        </w:rPr>
+        <w:t xml:space="preserve"> "192.168.1.198",</w:t>
+      </w:r>
+    </w:p>
+    <w:p>
+      <w:pPr>
+        <w:rPr>
+          <w:rFonts w:ascii="Cambria" w:hAnsi="Cambria"/>
+          <w:sz w:val="24"/>
+          <w:szCs w:val="24"/>
+        </w:rPr>
+      </w:pPr>
+      <w:r>
+        <w:rPr>
+          <w:rFonts w:ascii="Cambria" w:hAnsi="Cambria"/>
+          <w:sz w:val="24"/>
+          <w:szCs w:val="24"/>
+        </w:rPr>
+        <w:t xml:space="preserve">          "comment</w:t>
+      </w:r>
+      <w:proofErr w:type="gramStart"/>
+      <w:r>
+        <w:rPr>
+          <w:rFonts w:ascii="Cambria" w:hAnsi="Cambria"/>
+          <w:sz w:val="24"/>
+          <w:szCs w:val="24"/>
+        </w:rPr>
+        <w:t>":</w:t>
+      </w:r>
+      <w:proofErr w:type="gramEnd"/>
+      <w:r>
+        <w:rPr>
+          <w:rFonts w:ascii="Cambria" w:hAnsi="Cambria"/>
+          <w:sz w:val="24"/>
+          <w:szCs w:val="24"/>
+        </w:rPr>
+        <w:t xml:space="preserve"> "Suspicion de ransomware"</w:t>
+      </w:r>
+    </w:p>
+    <w:p>
+      <w:pPr>
+        <w:rPr>
+          <w:rFonts w:ascii="Cambria" w:hAnsi="Cambria"/>
+          <w:sz w:val="24"/>
+          <w:szCs w:val="24"/>
+        </w:rPr>
+      </w:pPr>
+      <w:r>
+        <w:rPr>
+          <w:rFonts w:ascii="Cambria" w:hAnsi="Cambria"/>
+          <w:sz w:val="24"/>
+          <w:szCs w:val="24"/>
+        </w:rPr>
+        <w:t xml:space="preserve">        }</w:t>
+      </w:r>
+    </w:p>
+    <w:p>
+      <w:pPr>
+        <w:rPr>
+          <w:rFonts w:ascii="Cambria" w:hAnsi="Cambria"/>
+          <w:sz w:val="24"/>
+          <w:szCs w:val="24"/>
+        </w:rPr>
+      </w:pPr>
+      <w:r>
+        <w:rPr>
+          <w:rFonts w:ascii="Cambria" w:hAnsi="Cambria"/>
+          <w:sz w:val="24"/>
+          <w:szCs w:val="24"/>
+        </w:rPr>
+        <w:t xml:space="preserve">      }</w:t>
+      </w:r>
+    </w:p>
+    <w:p>
+      <w:pPr>
+        <w:rPr>
+          <w:rFonts w:ascii="Cambria" w:hAnsi="Cambria"/>
+          <w:sz w:val="24"/>
+          <w:szCs w:val="24"/>
+        </w:rPr>
+      </w:pPr>
+      <w:r>
+        <w:rPr>
+          <w:rFonts w:ascii="Cambria" w:hAnsi="Cambria"/>
+          <w:sz w:val="24"/>
+          <w:szCs w:val="24"/>
+        </w:rPr>
+        <w:t xml:space="preserve">    ],</w:t>
+      </w:r>
+    </w:p>
+    <w:p>
+      <w:pPr>
+        <w:rPr>
+          <w:rFonts w:ascii="Cambria" w:hAnsi="Cambria"/>
+          <w:sz w:val="24"/>
+          <w:szCs w:val="24"/>
+        </w:rPr>
+      </w:pPr>
+      <w:r>
+        <w:rPr>
+          <w:rFonts w:ascii="Cambria" w:hAnsi="Cambria"/>
+          <w:sz w:val="24"/>
+          <w:szCs w:val="24"/>
+        </w:rPr>
+        <w:t xml:space="preserve">    "</w:t>
+      </w:r>
+      <w:proofErr w:type="spellStart"/>
+      <w:r>
+        <w:rPr>
+          <w:rFonts w:ascii="Cambria" w:hAnsi="Cambria"/>
+          <w:sz w:val="24"/>
+          <w:szCs w:val="24"/>
+        </w:rPr>
+        <w:t>timeout_seconds</w:t>
+      </w:r>
+      <w:proofErr w:type="spellEnd"/>
+      <w:proofErr w:type="gramStart"/>
+      <w:r>
+        <w:rPr>
+          <w:rFonts w:ascii="Cambria" w:hAnsi="Cambria"/>
+          <w:sz w:val="24"/>
+          <w:szCs w:val="24"/>
+        </w:rPr>
+        <w:t>":</w:t>
+      </w:r>
+      <w:proofErr w:type="gramEnd"/>
+      <w:r>
+        <w:rPr>
+          <w:rFonts w:ascii="Cambria" w:hAnsi="Cambria"/>
+          <w:sz w:val="24"/>
+          <w:szCs w:val="24"/>
+        </w:rPr>
+        <w:t xml:space="preserve"> 300,</w:t>
+      </w:r>
+    </w:p>
+    <w:p>
+      <w:pPr>
+        <w:rPr>
+          <w:rFonts w:ascii="Cambria" w:hAnsi="Cambria"/>
+          <w:sz w:val="24"/>
+          <w:szCs w:val="24"/>
+        </w:rPr>
+      </w:pPr>
+      <w:r>
+        <w:rPr>
+          <w:rFonts w:ascii="Cambria" w:hAnsi="Cambria"/>
+          <w:sz w:val="24"/>
+          <w:szCs w:val="24"/>
+        </w:rPr>
+        <w:t xml:space="preserve">    "</w:t>
+      </w:r>
+      <w:proofErr w:type="spellStart"/>
+      <w:r>
+        <w:rPr>
+          <w:rFonts w:ascii="Cambria" w:hAnsi="Cambria"/>
+          <w:sz w:val="24"/>
+          <w:szCs w:val="24"/>
+        </w:rPr>
+        <w:t>max_retries</w:t>
+      </w:r>
+      <w:proofErr w:type="spellEnd"/>
+      <w:proofErr w:type="gramStart"/>
+      <w:r>
+        <w:rPr>
+          <w:rFonts w:ascii="Cambria" w:hAnsi="Cambria"/>
+          <w:sz w:val="24"/>
+          <w:szCs w:val="24"/>
+        </w:rPr>
+        <w:t>":</w:t>
+      </w:r>
+      <w:proofErr w:type="gramEnd"/>
+      <w:r>
+        <w:rPr>
+          <w:rFonts w:ascii="Cambria" w:hAnsi="Cambria"/>
+          <w:sz w:val="24"/>
+          <w:szCs w:val="24"/>
+        </w:rPr>
+        <w:t xml:space="preserve"> 1</w:t>
+      </w:r>
+    </w:p>
+    <w:p>
+      <w:pPr>
+        <w:rPr>
+          <w:rFonts w:ascii="Cambria" w:hAnsi="Cambria"/>
+          <w:sz w:val="24"/>
+          <w:szCs w:val="24"/>
+        </w:rPr>
+      </w:pPr>
+      <w:r>
+        <w:rPr>
+          <w:rFonts w:ascii="Cambria" w:hAnsi="Cambria"/>
+          <w:sz w:val="24"/>
+          <w:szCs w:val="24"/>
+        </w:rPr>
+        <w:t xml:space="preserve">  }</w:t>
+      </w:r>
+    </w:p>
+    <w:p>
+      <w:pPr>
+        <w:rPr>
+          <w:rFonts w:ascii="Cambria" w:hAnsi="Cambria"/>
+          <w:sz w:val="24"/>
+          <w:szCs w:val="24"/>
+        </w:rPr>
+      </w:pPr>
+      <w:r>
+        <w:rPr>
+          <w:rFonts w:ascii="Cambria" w:hAnsi="Cambria"/>
+          <w:sz w:val="24"/>
+          <w:szCs w:val="24"/>
+        </w:rPr>
+        <w:t>]</w:t>
+      </w:r>
     </w:p>
     <w:sectPr>
       <w:pgSz w:w="11906" w:h="16838"/>
@@ -809,6 +3099,475 @@
     </w:sectPr>
   </w:body>
 </w:document>
+</file>
+
+<file path=word/numbering.xml><?xml version="1.0" encoding="utf-8"?>
+<w:numbering xmlns:wpc="http://schemas.microsoft.com/office/word/2010/wordprocessingCanvas" xmlns:cx="http://schemas.microsoft.com/office/drawing/2014/chartex" xmlns:cx1="http://schemas.microsoft.com/office/drawing/2015/9/8/chartex" xmlns:cx2="http://schemas.microsoft.com/office/drawing/2015/10/21/chartex" xmlns:cx3="http://schemas.microsoft.com/office/drawing/2016/5/9/chartex" xmlns:cx4="http://schemas.microsoft.com/office/drawing/2016/5/10/chartex" xmlns:cx5="http://schemas.microsoft.com/office/drawing/2016/5/11/chartex" xmlns:cx6="http://schemas.microsoft.com/office/drawing/2016/5/12/chartex" xmlns:cx7="http://schemas.microsoft.com/office/drawing/2016/5/13/chartex" xmlns:cx8="http://schemas.microsoft.com/office/drawing/2016/5/14/chartex" xmlns:mc="http://schemas.openxmlformats.org/markup-compatibility/2006" xmlns:aink="http://schemas.microsoft.com/office/drawing/2016/ink" xmlns:am3d="http://schemas.microsoft.com/office/drawing/2017/model3d" xmlns:o="urn:schemas-microsoft-com:office:office" xmlns:r="http://schemas.openxmlformats.org/officeDocument/2006/relationships" xmlns:m="http://schemas.openxmlformats.org/officeDocument/2006/math" xmlns:v="urn:schemas-microsoft-com:vml" xmlns:wp14="http://schemas.microsoft.com/office/word/2010/wordprocessingDrawing" xmlns:wp="http://schemas.openxmlformats.org/drawingml/2006/wordprocessingDrawing" xmlns:w10="urn:schemas-microsoft-com:office:word" xmlns:w="http://schemas.openxmlformats.org/wordprocessingml/2006/main" xmlns:w14="http://schemas.microsoft.com/office/word/2010/wordml" xmlns:w15="http://schemas.microsoft.com/office/word/2012/wordml" xmlns:w16cex="http://schemas.microsoft.com/office/word/2018/wordml/cex" xmlns:w16cid="http://schemas.microsoft.com/office/word/2016/wordml/cid" xmlns:w16="http://schemas.microsoft.com/office/word/2018/wordml" xmlns:w16sdtdh="http://schemas.microsoft.com/office/word/2020/wordml/sdtdatahash" xmlns:w16se="http://schemas.microsoft.com/office/word/2015/wordml/symex" xmlns:wpg="http://schemas.microsoft.com/office/word/2010/wordprocessingGroup" xmlns:wpi="http://schemas.microsoft.com/office/word/2010/wordprocessingInk" xmlns:wne="http://schemas.microsoft.com/office/word/2006/wordml" xmlns:wps="http://schemas.microsoft.com/office/word/2010/wordprocessingShape" mc:Ignorable="w14 w15 w16se w16cid w16 w16cex w16sdtdh wp14">
+  <w:abstractNum w:abstractNumId="0" w15:restartNumberingAfterBreak="0">
+    <w:nsid w:val="2C3F2ABE"/>
+    <w:multiLevelType w:val="hybridMultilevel"/>
+    <w:tmpl w:val="DF880ACA"/>
+    <w:lvl w:ilvl="0" w:tplc="040C0001">
+      <w:start w:val="1"/>
+      <w:numFmt w:val="bullet"/>
+      <w:lvlText w:val=""/>
+      <w:lvlJc w:val="left"/>
+      <w:pPr>
+        <w:ind w:left="720" w:hanging="360"/>
+      </w:pPr>
+      <w:rPr>
+        <w:rFonts w:ascii="Symbol" w:hAnsi="Symbol" w:hint="default"/>
+      </w:rPr>
+    </w:lvl>
+    <w:lvl w:ilvl="1" w:tplc="040C0003" w:tentative="1">
+      <w:start w:val="1"/>
+      <w:numFmt w:val="bullet"/>
+      <w:lvlText w:val="o"/>
+      <w:lvlJc w:val="left"/>
+      <w:pPr>
+        <w:ind w:left="1440" w:hanging="360"/>
+      </w:pPr>
+      <w:rPr>
+        <w:rFonts w:ascii="Courier New" w:hAnsi="Courier New" w:cs="Courier New" w:hint="default"/>
+      </w:rPr>
+    </w:lvl>
+    <w:lvl w:ilvl="2" w:tplc="040C0005" w:tentative="1">
+      <w:start w:val="1"/>
+      <w:numFmt w:val="bullet"/>
+      <w:lvlText w:val=""/>
+      <w:lvlJc w:val="left"/>
+      <w:pPr>
+        <w:ind w:left="2160" w:hanging="360"/>
+      </w:pPr>
+      <w:rPr>
+        <w:rFonts w:ascii="Wingdings" w:hAnsi="Wingdings" w:hint="default"/>
+      </w:rPr>
+    </w:lvl>
+    <w:lvl w:ilvl="3" w:tplc="040C0001" w:tentative="1">
+      <w:start w:val="1"/>
+      <w:numFmt w:val="bullet"/>
+      <w:lvlText w:val=""/>
+      <w:lvlJc w:val="left"/>
+      <w:pPr>
+        <w:ind w:left="2880" w:hanging="360"/>
+      </w:pPr>
+      <w:rPr>
+        <w:rFonts w:ascii="Symbol" w:hAnsi="Symbol" w:hint="default"/>
+      </w:rPr>
+    </w:lvl>
+    <w:lvl w:ilvl="4" w:tplc="040C0003" w:tentative="1">
+      <w:start w:val="1"/>
+      <w:numFmt w:val="bullet"/>
+      <w:lvlText w:val="o"/>
+      <w:lvlJc w:val="left"/>
+      <w:pPr>
+        <w:ind w:left="3600" w:hanging="360"/>
+      </w:pPr>
+      <w:rPr>
+        <w:rFonts w:ascii="Courier New" w:hAnsi="Courier New" w:cs="Courier New" w:hint="default"/>
+      </w:rPr>
+    </w:lvl>
+    <w:lvl w:ilvl="5" w:tplc="040C0005" w:tentative="1">
+      <w:start w:val="1"/>
+      <w:numFmt w:val="bullet"/>
+      <w:lvlText w:val=""/>
+      <w:lvlJc w:val="left"/>
+      <w:pPr>
+        <w:ind w:left="4320" w:hanging="360"/>
+      </w:pPr>
+      <w:rPr>
+        <w:rFonts w:ascii="Wingdings" w:hAnsi="Wingdings" w:hint="default"/>
+      </w:rPr>
+    </w:lvl>
+    <w:lvl w:ilvl="6" w:tplc="040C0001" w:tentative="1">
+      <w:start w:val="1"/>
+      <w:numFmt w:val="bullet"/>
+      <w:lvlText w:val=""/>
+      <w:lvlJc w:val="left"/>
+      <w:pPr>
+        <w:ind w:left="5040" w:hanging="360"/>
+      </w:pPr>
+      <w:rPr>
+        <w:rFonts w:ascii="Symbol" w:hAnsi="Symbol" w:hint="default"/>
+      </w:rPr>
+    </w:lvl>
+    <w:lvl w:ilvl="7" w:tplc="040C0003" w:tentative="1">
+      <w:start w:val="1"/>
+      <w:numFmt w:val="bullet"/>
+      <w:lvlText w:val="o"/>
+      <w:lvlJc w:val="left"/>
+      <w:pPr>
+        <w:ind w:left="5760" w:hanging="360"/>
+      </w:pPr>
+      <w:rPr>
+        <w:rFonts w:ascii="Courier New" w:hAnsi="Courier New" w:cs="Courier New" w:hint="default"/>
+      </w:rPr>
+    </w:lvl>
+    <w:lvl w:ilvl="8" w:tplc="040C0005" w:tentative="1">
+      <w:start w:val="1"/>
+      <w:numFmt w:val="bullet"/>
+      <w:lvlText w:val=""/>
+      <w:lvlJc w:val="left"/>
+      <w:pPr>
+        <w:ind w:left="6480" w:hanging="360"/>
+      </w:pPr>
+      <w:rPr>
+        <w:rFonts w:ascii="Wingdings" w:hAnsi="Wingdings" w:hint="default"/>
+      </w:rPr>
+    </w:lvl>
+  </w:abstractNum>
+  <w:abstractNum w:abstractNumId="1" w15:restartNumberingAfterBreak="0">
+    <w:nsid w:val="594452E4"/>
+    <w:multiLevelType w:val="hybridMultilevel"/>
+    <w:tmpl w:val="9D0070A0"/>
+    <w:lvl w:ilvl="0" w:tplc="2C0C0009">
+      <w:start w:val="1"/>
+      <w:numFmt w:val="bullet"/>
+      <w:lvlText w:val=""/>
+      <w:lvlJc w:val="left"/>
+      <w:pPr>
+        <w:ind w:left="720" w:hanging="360"/>
+      </w:pPr>
+      <w:rPr>
+        <w:rFonts w:ascii="Wingdings" w:hAnsi="Wingdings" w:hint="default"/>
+      </w:rPr>
+    </w:lvl>
+    <w:lvl w:ilvl="1" w:tplc="040C0003" w:tentative="1">
+      <w:start w:val="1"/>
+      <w:numFmt w:val="bullet"/>
+      <w:lvlText w:val="o"/>
+      <w:lvlJc w:val="left"/>
+      <w:pPr>
+        <w:ind w:left="1440" w:hanging="360"/>
+      </w:pPr>
+      <w:rPr>
+        <w:rFonts w:ascii="Courier New" w:hAnsi="Courier New" w:cs="Courier New" w:hint="default"/>
+      </w:rPr>
+    </w:lvl>
+    <w:lvl w:ilvl="2" w:tplc="040C0005" w:tentative="1">
+      <w:start w:val="1"/>
+      <w:numFmt w:val="bullet"/>
+      <w:lvlText w:val=""/>
+      <w:lvlJc w:val="left"/>
+      <w:pPr>
+        <w:ind w:left="2160" w:hanging="360"/>
+      </w:pPr>
+      <w:rPr>
+        <w:rFonts w:ascii="Wingdings" w:hAnsi="Wingdings" w:hint="default"/>
+      </w:rPr>
+    </w:lvl>
+    <w:lvl w:ilvl="3" w:tplc="040C0001" w:tentative="1">
+      <w:start w:val="1"/>
+      <w:numFmt w:val="bullet"/>
+      <w:lvlText w:val=""/>
+      <w:lvlJc w:val="left"/>
+      <w:pPr>
+        <w:ind w:left="2880" w:hanging="360"/>
+      </w:pPr>
+      <w:rPr>
+        <w:rFonts w:ascii="Symbol" w:hAnsi="Symbol" w:hint="default"/>
+      </w:rPr>
+    </w:lvl>
+    <w:lvl w:ilvl="4" w:tplc="040C0003" w:tentative="1">
+      <w:start w:val="1"/>
+      <w:numFmt w:val="bullet"/>
+      <w:lvlText w:val="o"/>
+      <w:lvlJc w:val="left"/>
+      <w:pPr>
+        <w:ind w:left="3600" w:hanging="360"/>
+      </w:pPr>
+      <w:rPr>
+        <w:rFonts w:ascii="Courier New" w:hAnsi="Courier New" w:cs="Courier New" w:hint="default"/>
+      </w:rPr>
+    </w:lvl>
+    <w:lvl w:ilvl="5" w:tplc="040C0005" w:tentative="1">
+      <w:start w:val="1"/>
+      <w:numFmt w:val="bullet"/>
+      <w:lvlText w:val=""/>
+      <w:lvlJc w:val="left"/>
+      <w:pPr>
+        <w:ind w:left="4320" w:hanging="360"/>
+      </w:pPr>
+      <w:rPr>
+        <w:rFonts w:ascii="Wingdings" w:hAnsi="Wingdings" w:hint="default"/>
+      </w:rPr>
+    </w:lvl>
+    <w:lvl w:ilvl="6" w:tplc="040C0001" w:tentative="1">
+      <w:start w:val="1"/>
+      <w:numFmt w:val="bullet"/>
+      <w:lvlText w:val=""/>
+      <w:lvlJc w:val="left"/>
+      <w:pPr>
+        <w:ind w:left="5040" w:hanging="360"/>
+      </w:pPr>
+      <w:rPr>
+        <w:rFonts w:ascii="Symbol" w:hAnsi="Symbol" w:hint="default"/>
+      </w:rPr>
+    </w:lvl>
+    <w:lvl w:ilvl="7" w:tplc="040C0003" w:tentative="1">
+      <w:start w:val="1"/>
+      <w:numFmt w:val="bullet"/>
+      <w:lvlText w:val="o"/>
+      <w:lvlJc w:val="left"/>
+      <w:pPr>
+        <w:ind w:left="5760" w:hanging="360"/>
+      </w:pPr>
+      <w:rPr>
+        <w:rFonts w:ascii="Courier New" w:hAnsi="Courier New" w:cs="Courier New" w:hint="default"/>
+      </w:rPr>
+    </w:lvl>
+    <w:lvl w:ilvl="8" w:tplc="040C0005" w:tentative="1">
+      <w:start w:val="1"/>
+      <w:numFmt w:val="bullet"/>
+      <w:lvlText w:val=""/>
+      <w:lvlJc w:val="left"/>
+      <w:pPr>
+        <w:ind w:left="6480" w:hanging="360"/>
+      </w:pPr>
+      <w:rPr>
+        <w:rFonts w:ascii="Wingdings" w:hAnsi="Wingdings" w:hint="default"/>
+      </w:rPr>
+    </w:lvl>
+  </w:abstractNum>
+  <w:abstractNum w:abstractNumId="2" w15:restartNumberingAfterBreak="0">
+    <w:nsid w:val="59C34401"/>
+    <w:multiLevelType w:val="hybridMultilevel"/>
+    <w:tmpl w:val="5C1C121C"/>
+    <w:lvl w:ilvl="0" w:tplc="2C0C0009">
+      <w:start w:val="1"/>
+      <w:numFmt w:val="bullet"/>
+      <w:lvlText w:val=""/>
+      <w:lvlJc w:val="left"/>
+      <w:pPr>
+        <w:ind w:left="720" w:hanging="360"/>
+      </w:pPr>
+      <w:rPr>
+        <w:rFonts w:ascii="Wingdings" w:hAnsi="Wingdings" w:hint="default"/>
+      </w:rPr>
+    </w:lvl>
+    <w:lvl w:ilvl="1" w:tplc="040C0003" w:tentative="1">
+      <w:start w:val="1"/>
+      <w:numFmt w:val="bullet"/>
+      <w:lvlText w:val="o"/>
+      <w:lvlJc w:val="left"/>
+      <w:pPr>
+        <w:ind w:left="1440" w:hanging="360"/>
+      </w:pPr>
+      <w:rPr>
+        <w:rFonts w:ascii="Courier New" w:hAnsi="Courier New" w:cs="Courier New" w:hint="default"/>
+      </w:rPr>
+    </w:lvl>
+    <w:lvl w:ilvl="2" w:tplc="040C0005" w:tentative="1">
+      <w:start w:val="1"/>
+      <w:numFmt w:val="bullet"/>
+      <w:lvlText w:val=""/>
+      <w:lvlJc w:val="left"/>
+      <w:pPr>
+        <w:ind w:left="2160" w:hanging="360"/>
+      </w:pPr>
+      <w:rPr>
+        <w:rFonts w:ascii="Wingdings" w:hAnsi="Wingdings" w:hint="default"/>
+      </w:rPr>
+    </w:lvl>
+    <w:lvl w:ilvl="3" w:tplc="040C0001" w:tentative="1">
+      <w:start w:val="1"/>
+      <w:numFmt w:val="bullet"/>
+      <w:lvlText w:val=""/>
+      <w:lvlJc w:val="left"/>
+      <w:pPr>
+        <w:ind w:left="2880" w:hanging="360"/>
+      </w:pPr>
+      <w:rPr>
+        <w:rFonts w:ascii="Symbol" w:hAnsi="Symbol" w:hint="default"/>
+      </w:rPr>
+    </w:lvl>
+    <w:lvl w:ilvl="4" w:tplc="040C0003" w:tentative="1">
+      <w:start w:val="1"/>
+      <w:numFmt w:val="bullet"/>
+      <w:lvlText w:val="o"/>
+      <w:lvlJc w:val="left"/>
+      <w:pPr>
+        <w:ind w:left="3600" w:hanging="360"/>
+      </w:pPr>
+      <w:rPr>
+        <w:rFonts w:ascii="Courier New" w:hAnsi="Courier New" w:cs="Courier New" w:hint="default"/>
+      </w:rPr>
+    </w:lvl>
+    <w:lvl w:ilvl="5" w:tplc="040C0005" w:tentative="1">
+      <w:start w:val="1"/>
+      <w:numFmt w:val="bullet"/>
+      <w:lvlText w:val=""/>
+      <w:lvlJc w:val="left"/>
+      <w:pPr>
+        <w:ind w:left="4320" w:hanging="360"/>
+      </w:pPr>
+      <w:rPr>
+        <w:rFonts w:ascii="Wingdings" w:hAnsi="Wingdings" w:hint="default"/>
+      </w:rPr>
+    </w:lvl>
+    <w:lvl w:ilvl="6" w:tplc="040C0001" w:tentative="1">
+      <w:start w:val="1"/>
+      <w:numFmt w:val="bullet"/>
+      <w:lvlText w:val=""/>
+      <w:lvlJc w:val="left"/>
+      <w:pPr>
+        <w:ind w:left="5040" w:hanging="360"/>
+      </w:pPr>
+      <w:rPr>
+        <w:rFonts w:ascii="Symbol" w:hAnsi="Symbol" w:hint="default"/>
+      </w:rPr>
+    </w:lvl>
+    <w:lvl w:ilvl="7" w:tplc="040C0003" w:tentative="1">
+      <w:start w:val="1"/>
+      <w:numFmt w:val="bullet"/>
+      <w:lvlText w:val="o"/>
+      <w:lvlJc w:val="left"/>
+      <w:pPr>
+        <w:ind w:left="5760" w:hanging="360"/>
+      </w:pPr>
+      <w:rPr>
+        <w:rFonts w:ascii="Courier New" w:hAnsi="Courier New" w:cs="Courier New" w:hint="default"/>
+      </w:rPr>
+    </w:lvl>
+    <w:lvl w:ilvl="8" w:tplc="040C0005" w:tentative="1">
+      <w:start w:val="1"/>
+      <w:numFmt w:val="bullet"/>
+      <w:lvlText w:val=""/>
+      <w:lvlJc w:val="left"/>
+      <w:pPr>
+        <w:ind w:left="6480" w:hanging="360"/>
+      </w:pPr>
+      <w:rPr>
+        <w:rFonts w:ascii="Wingdings" w:hAnsi="Wingdings" w:hint="default"/>
+      </w:rPr>
+    </w:lvl>
+  </w:abstractNum>
+  <w:abstractNum w:abstractNumId="3" w15:restartNumberingAfterBreak="0">
+    <w:nsid w:val="70523710"/>
+    <w:multiLevelType w:val="hybridMultilevel"/>
+    <w:tmpl w:val="344A5B9E"/>
+    <w:lvl w:ilvl="0" w:tplc="2C0C0009">
+      <w:start w:val="1"/>
+      <w:numFmt w:val="bullet"/>
+      <w:lvlText w:val=""/>
+      <w:lvlJc w:val="left"/>
+      <w:pPr>
+        <w:ind w:left="720" w:hanging="360"/>
+      </w:pPr>
+      <w:rPr>
+        <w:rFonts w:ascii="Wingdings" w:hAnsi="Wingdings" w:hint="default"/>
+      </w:rPr>
+    </w:lvl>
+    <w:lvl w:ilvl="1" w:tplc="040C0003" w:tentative="1">
+      <w:start w:val="1"/>
+      <w:numFmt w:val="bullet"/>
+      <w:lvlText w:val="o"/>
+      <w:lvlJc w:val="left"/>
+      <w:pPr>
+        <w:ind w:left="1440" w:hanging="360"/>
+      </w:pPr>
+      <w:rPr>
+        <w:rFonts w:ascii="Courier New" w:hAnsi="Courier New" w:cs="Courier New" w:hint="default"/>
+      </w:rPr>
+    </w:lvl>
+    <w:lvl w:ilvl="2" w:tplc="040C0005" w:tentative="1">
+      <w:start w:val="1"/>
+      <w:numFmt w:val="bullet"/>
+      <w:lvlText w:val=""/>
+      <w:lvlJc w:val="left"/>
+      <w:pPr>
+        <w:ind w:left="2160" w:hanging="360"/>
+      </w:pPr>
+      <w:rPr>
+        <w:rFonts w:ascii="Wingdings" w:hAnsi="Wingdings" w:hint="default"/>
+      </w:rPr>
+    </w:lvl>
+    <w:lvl w:ilvl="3" w:tplc="040C0001" w:tentative="1">
+      <w:start w:val="1"/>
+      <w:numFmt w:val="bullet"/>
+      <w:lvlText w:val=""/>
+      <w:lvlJc w:val="left"/>
+      <w:pPr>
+        <w:ind w:left="2880" w:hanging="360"/>
+      </w:pPr>
+      <w:rPr>
+        <w:rFonts w:ascii="Symbol" w:hAnsi="Symbol" w:hint="default"/>
+      </w:rPr>
+    </w:lvl>
+    <w:lvl w:ilvl="4" w:tplc="040C0003" w:tentative="1">
+      <w:start w:val="1"/>
+      <w:numFmt w:val="bullet"/>
+      <w:lvlText w:val="o"/>
+      <w:lvlJc w:val="left"/>
+      <w:pPr>
+        <w:ind w:left="3600" w:hanging="360"/>
+      </w:pPr>
+      <w:rPr>
+        <w:rFonts w:ascii="Courier New" w:hAnsi="Courier New" w:cs="Courier New" w:hint="default"/>
+      </w:rPr>
+    </w:lvl>
+    <w:lvl w:ilvl="5" w:tplc="040C0005" w:tentative="1">
+      <w:start w:val="1"/>
+      <w:numFmt w:val="bullet"/>
+      <w:lvlText w:val=""/>
+      <w:lvlJc w:val="left"/>
+      <w:pPr>
+        <w:ind w:left="4320" w:hanging="360"/>
+      </w:pPr>
+      <w:rPr>
+        <w:rFonts w:ascii="Wingdings" w:hAnsi="Wingdings" w:hint="default"/>
+      </w:rPr>
+    </w:lvl>
+    <w:lvl w:ilvl="6" w:tplc="040C0001" w:tentative="1">
+      <w:start w:val="1"/>
+      <w:numFmt w:val="bullet"/>
+      <w:lvlText w:val=""/>
+      <w:lvlJc w:val="left"/>
+      <w:pPr>
+        <w:ind w:left="5040" w:hanging="360"/>
+      </w:pPr>
+      <w:rPr>
+        <w:rFonts w:ascii="Symbol" w:hAnsi="Symbol" w:hint="default"/>
+      </w:rPr>
+    </w:lvl>
+    <w:lvl w:ilvl="7" w:tplc="040C0003" w:tentative="1">
+      <w:start w:val="1"/>
+      <w:numFmt w:val="bullet"/>
+      <w:lvlText w:val="o"/>
+      <w:lvlJc w:val="left"/>
+      <w:pPr>
+        <w:ind w:left="5760" w:hanging="360"/>
+      </w:pPr>
+      <w:rPr>
+        <w:rFonts w:ascii="Courier New" w:hAnsi="Courier New" w:cs="Courier New" w:hint="default"/>
+      </w:rPr>
+    </w:lvl>
+    <w:lvl w:ilvl="8" w:tplc="040C0005" w:tentative="1">
+      <w:start w:val="1"/>
+      <w:numFmt w:val="bullet"/>
+      <w:lvlText w:val=""/>
+      <w:lvlJc w:val="left"/>
+      <w:pPr>
+        <w:ind w:left="6480" w:hanging="360"/>
+      </w:pPr>
+      <w:rPr>
+        <w:rFonts w:ascii="Wingdings" w:hAnsi="Wingdings" w:hint="default"/>
+      </w:rPr>
+    </w:lvl>
+  </w:abstractNum>
+  <w:num w:numId="1">
+    <w:abstractNumId w:val="0"/>
+  </w:num>
+  <w:num w:numId="2">
+    <w:abstractNumId w:val="2"/>
+  </w:num>
+  <w:num w:numId="3">
+    <w:abstractNumId w:val="3"/>
+  </w:num>
+  <w:num w:numId="4">
+    <w:abstractNumId w:val="1"/>
+  </w:num>
+</w:numbering>
 </file>
 
 <file path=word/styles.xml><?xml version="1.0" encoding="utf-8"?>
@@ -1237,6 +3996,17 @@
     <w:semiHidden/>
     <w:unhideWhenUsed/>
   </w:style>
+  <w:style w:type="paragraph" w:styleId="Paragraphedeliste">
+    <w:name w:val="List Paragraph"/>
+    <w:basedOn w:val="Normal"/>
+    <w:uiPriority w:val="34"/>
+    <w:qFormat/>
+    <w:rsid w:val="007E2D70"/>
+    <w:pPr>
+      <w:ind w:left="720"/>
+      <w:contextualSpacing/>
+    </w:pPr>
+  </w:style>
 </w:styles>
 </file>
 

</xml_diff>